<commit_message>
Document instructor-paced reveals using successive access codes
Adds guidance to section 08 of the design manual on splitting a case
into separately encrypted parts so the instructor controls when the
evidence reveal opens. Also notes the release method in the reveal
template, adds a release check, and updates contents page numbers.

Co-Authored-By: Claude Opus 5.5 <noreply@anthropic.com>
Claude-Session: https://claude.ai/code/session_01UAtA3GKShmJZddHwkkVsz1
</commit_message>
<xml_diff>
--- a/planning/ETHOS_Bioethics_Simulator_Design_and_Iteration_Manual.docx
+++ b/planning/ETHOS_Bioethics_Simulator_Design_and_Iteration_Manual.docx
@@ -746,7 +746,7 @@
                 <w:color w:val="000000"/>
                 <w:sz w:val="18"/>
               </w:rPr>
-              <w:t>10</w:t>
+              <w:t>11</w:t>
             </w:r>
           </w:p>
         </w:tc>
@@ -815,7 +815,7 @@
                 <w:color w:val="000000"/>
                 <w:sz w:val="18"/>
               </w:rPr>
-              <w:t>11</w:t>
+              <w:t>12</w:t>
             </w:r>
           </w:p>
         </w:tc>
@@ -884,7 +884,7 @@
                 <w:color w:val="000000"/>
                 <w:sz w:val="18"/>
               </w:rPr>
-              <w:t>12</w:t>
+              <w:t>13</w:t>
             </w:r>
           </w:p>
         </w:tc>
@@ -953,7 +953,7 @@
                 <w:color w:val="000000"/>
                 <w:sz w:val="18"/>
               </w:rPr>
-              <w:t>13</w:t>
+              <w:t>14</w:t>
             </w:r>
           </w:p>
         </w:tc>
@@ -1022,7 +1022,7 @@
                 <w:color w:val="000000"/>
                 <w:sz w:val="18"/>
               </w:rPr>
-              <w:t>14</w:t>
+              <w:t>15</w:t>
             </w:r>
           </w:p>
         </w:tc>
@@ -1091,7 +1091,7 @@
                 <w:color w:val="000000"/>
                 <w:sz w:val="18"/>
               </w:rPr>
-              <w:t>15</w:t>
+              <w:t>16</w:t>
             </w:r>
           </w:p>
         </w:tc>
@@ -5427,6 +5427,64 @@
         <w:pStyle w:val="Heading2"/>
       </w:pPr>
       <w:r>
+        <w:t>Pace reveals with successive access codes</w:t>
+      </w:r>
+    </w:p>
+    <w:p>
+      <w:r>
+        <w:t xml:space="preserve">When the whole class should meet a reveal at the same moment, publish the case on the course website as successive parts, each encrypted with its own access code. Part 1 runs through the commitment the reveal will test, such as the provisional recommendation. Part 2 opens with the new evidence. Announce the Part 2 code when you want the reveal to land, ideally after a short discussion of provisional views. This gives the instructor control over timing without a dashboard, server, or accounts.</w:t>
+      </w:r>
+    </w:p>
+    <w:p>
+      <w:pPr>
+        <w:pStyle w:val="ListBullet"/>
+      </w:pPr>
+      <w:r>
+        <w:t xml:space="preserve">Split only at a commitment point. Each part should end once students have recorded the view the next reveal puts under pressure.</w:t>
+      </w:r>
+    </w:p>
+    <w:p>
+      <w:pPr>
+        <w:pStyle w:val="ListBullet"/>
+      </w:pPr>
+      <w:r>
+        <w:t xml:space="preserve">Keep later content out of earlier files. Hiding a section with JavaScript does not protect it; anyone who unlocks Part 1 can read everything inside that file.</w:t>
+      </w:r>
+    </w:p>
+    <w:p>
+      <w:pPr>
+        <w:pStyle w:val="ListBullet"/>
+      </w:pPr>
+      <w:r>
+        <w:t xml:space="preserve">Plan how reasoning carries forward. Each part is a separate page, so Part 1 responses do not reach Part 2 automatically. Either have Part 1 end with a report download and ask students to restate their provisional recommendation at the start of Part 2, or share saved state between the parts in the browser. Shared state works only on the same device and browser and can fail in a private window, so specify and test it as a persistence feature.</w:t>
+      </w:r>
+    </w:p>
+    <w:p>
+      <w:pPr>
+        <w:pStyle w:val="ListBullet"/>
+      </w:pPr>
+      <w:r>
+        <w:t xml:space="preserve">Use an unrelated passphrase for each part. Never derive a later code from an earlier one, and never put a code or a hint in the public activity list.</w:t>
+      </w:r>
+    </w:p>
+    <w:p>
+      <w:pPr>
+        <w:pStyle w:val="ListBullet"/>
+      </w:pPr>
+      <w:r>
+        <w:t xml:space="preserve">Treat codes as control over timing, not secrecy. Students can share a code once it is announced, and changing a code does not revoke access to a copy already opened.</w:t>
+      </w:r>
+    </w:p>
+    <w:p>
+      <w:r>
+        <w:t xml:space="preserve">Either way, the final report must still show the initial and revised responses separately.</w:t>
+      </w:r>
+    </w:p>
+    <w:p>
+      <w:pPr>
+        <w:pStyle w:val="Heading2"/>
+      </w:pPr>
+      <w:r>
         <w:t>Audit for fairness</w:t>
       </w:r>
     </w:p>
@@ -8202,13 +8260,13 @@
           <w:b/>
           <w:sz w:val="20"/>
         </w:rPr>
-        <w:t>Evidence ID and release stage:</w:t>
+        <w:t>Evidence ID, release stage, and release method:</w:t>
       </w:r>
       <w:r>
         <w:rPr>
           <w:sz w:val="20"/>
         </w:rPr>
-        <w:t xml:space="preserve"> [ ]</w:t>
+        <w:t xml:space="preserve"> [ ] (within one file, or a separately coded part)</w:t>
         <w:br/>
       </w:r>
       <w:r>
@@ -8614,6 +8672,14 @@
       </w:pPr>
       <w:r>
         <w:t>Interviews and evidence appear at the intended point; back navigation preserves answers.</w:t>
+      </w:r>
+    </w:p>
+    <w:p>
+      <w:pPr>
+        <w:pStyle w:val="ListBullet"/>
+      </w:pPr>
+      <w:r>
+        <w:t xml:space="preserve">If a case is split into coded parts, no part contains content from a later part, and the chosen way of carrying reasoning forward works.</w:t>
       </w:r>
     </w:p>
     <w:p>

</xml_diff>

<commit_message>
Rebuild engine around a case file and open worksheet
Students now gather information from a case file of numbered tiles
(records, people, medical background, policies) opened in any order,
and answer worksheet sections in any order. Later parts add new items
marked New rather than staging a reveal. Adds plain-language medical
background items, a converter for old-format cases, and updates the
design manual and READMEs to match.

Co-Authored-By: Claude Opus 5.5 <noreply@anthropic.com>
Claude-Session: https://claude.ai/code/session_01UAtA3GmVs4fdgvH26R4rvY
</commit_message>
<xml_diff>
--- a/planning/ETHOS_Bioethics_Simulator_Design_and_Iteration_Manual.docx
+++ b/planning/ETHOS_Bioethics_Simulator_Design_and_Iteration_Manual.docx
@@ -20,12 +20,12 @@
     </w:p>
     <w:p>
       <w:r>
-        <w:t>ETHOS places students in the role of an ethics consultation team. Students work through a case, listen to stakeholders, interpret new evidence, make a recommendation, and explain how their judgment developed. The educational product is the reasoning students can defend at the end of that process.</w:t>
+        <w:t>ETHOS places students in the role of an ethics consultation team. Students work from a case file, much as a team would around a table: they read the records, hear from the people involved, look up the medical background, and check the relevant policies, in whatever order their questions lead them. They then make a recommendation and explain how their judgment developed. The educational product is the reasoning students can defend at the end of that process.</w:t>
       </w:r>
     </w:p>
     <w:p>
       <w:r>
-        <w:t>Use this manual to develop additional cases while preserving a recognizable instructional structure. It connects case writing, interface design, technical behavior, classroom facilitation, and assessment. The six-stage sequence is the organizing framework; the case narrative and presentation can change around it.</w:t>
+        <w:t>Use this manual to develop additional cases while preserving a recognizable instructional structure. It connects case writing, interface design, technical behavior, classroom facilitation, and assessment. The case file and the worksheet are the organizing framework; the case narrative and presentation can change around them.</w:t>
       </w:r>
     </w:p>
     <w:p>
@@ -38,7 +38,7 @@
     </w:p>
     <w:p>
       <w:r>
-        <w:t>Begin with the learning goals and stage map. Draft the entire case before adding interactive features. Use the specification and templates near the end to brief a developer, then evaluate the finished simulation with the release checklist.</w:t>
+        <w:t>Begin with the learning goals and a map of the case file and worksheet. Draft the entire case before adding interactive features. Use the specification and templates near the end to brief a developer, then evaluate the finished simulation with the release checklist.</w:t>
       </w:r>
     </w:p>
     <w:p>
@@ -231,7 +231,7 @@
                 <w:color w:val="000000"/>
                 <w:sz w:val="18"/>
               </w:rPr>
-              <w:t>Six stage consultation structure</w:t>
+              <w:t>Case file and worksheet structure</w:t>
             </w:r>
           </w:p>
         </w:tc>
@@ -645,7 +645,7 @@
                 <w:color w:val="000000"/>
                 <w:sz w:val="18"/>
               </w:rPr>
-              <w:t>Stakeholders and evidence reveals</w:t>
+              <w:t>Case file items and new information</w:t>
             </w:r>
           </w:p>
         </w:tc>
@@ -1091,7 +1091,7 @@
                 <w:color w:val="000000"/>
                 <w:sz w:val="18"/>
               </w:rPr>
-              <w:t>16</w:t>
+              <w:t>17</w:t>
             </w:r>
           </w:p>
         </w:tc>
@@ -1135,7 +1135,7 @@
     </w:p>
     <w:p>
       <w:r>
-        <w:t>Information should arrive in a deliberate sequence. An initial position gives students something to revisit. Stakeholder interviews complicate that position, and a later evidence reveal creates a reason to revise it. Revision should remain visible in the final report so that changing one’s mind can count as thoughtful work.</w:t>
+        <w:t>Students gather information rather than receive it in a fixed order. Like a consultation team around a table, they decide what to open, divide the reading, and report back to each other. Information can still arrive in more than one release. An initial position gives students something to revisit, and a later release adds to the case file. Most new information is simply more to weigh, such as a new person to hear from or a document nobody had mentioned; occasionally it should prompt students to rethink. Either way, the report keeps the earlier view next to the later one, so changing one’s mind and explaining why one did not can both count as thoughtful work.</w:t>
       </w:r>
     </w:p>
     <w:p>
@@ -1183,7 +1183,7 @@
         <w:pStyle w:val="ListBullet"/>
       </w:pPr>
       <w:r>
-        <w:t>Explain how new information changes the recommendation or its conditions.</w:t>
+        <w:t>Explain whether and how new information affects the recommendation or its conditions.</w:t>
       </w:r>
     </w:p>
     <w:p>
@@ -1307,7 +1307,7 @@
                 <w:color w:val="000000"/>
                 <w:sz w:val="19"/>
               </w:rPr>
-              <w:t>Six-stage progression and a visible route to completion</w:t>
+              <w:t>A case file students explore freely, a worksheet, and a visible route to a finished report</w:t>
             </w:r>
           </w:p>
         </w:tc>
@@ -1408,7 +1408,7 @@
                 <w:color w:val="000000"/>
                 <w:sz w:val="19"/>
               </w:rPr>
-              <w:t>Stakeholder identities, reveal timing, and question types</w:t>
+              <w:t>Stakeholder identities, what new information arrives and when, and question types</w:t>
             </w:r>
           </w:p>
         </w:tc>
@@ -1580,12 +1580,12 @@
         <w:pStyle w:val="Heading1"/>
       </w:pPr>
       <w:r>
-        <w:t>02 Six stage consultation structure</w:t>
+        <w:t>02 Case file and worksheet structure</w:t>
       </w:r>
     </w:p>
     <w:p>
       <w:r>
-        <w:t>Use the following stage labels as a reusable authoring model. Each stage has a distinct learning task, a student artifact, and a clear condition for continuing. Cases may change the labels while retaining these functions.</w:t>
+        <w:t>Each case has two areas. The case file holds everything students can learn about the case, as numbered items they open in any order: records and documents, people involved, plain-language medical background, and policies, codes and law. The worksheet holds the written work, in sections students can answer in any order. Use the following as a reusable authoring model. Cases may change the labels while keeping these functions.</w:t>
       </w:r>
     </w:p>
     <w:tbl>
@@ -1633,7 +1633,7 @@
                 <w:color w:val="FFFFFF"/>
                 <w:sz w:val="19"/>
               </w:rPr>
-              <w:t>Stage</w:t>
+              <w:t>Area</w:t>
             </w:r>
           </w:p>
         </w:tc>
@@ -1697,7 +1697,7 @@
                 <w:color w:val="FFFFFF"/>
                 <w:sz w:val="19"/>
               </w:rPr>
-              <w:t>Saved artifact</w:t>
+              <w:t>Saved work</w:t>
             </w:r>
           </w:p>
         </w:tc>
@@ -1734,7 +1734,7 @@
                 <w:color w:val="000000"/>
                 <w:sz w:val="19"/>
               </w:rPr>
-              <w:t>1  Intake and framing</w:t>
+              <w:t>Case file (any time)</w:t>
             </w:r>
           </w:p>
         </w:tc>
@@ -1766,7 +1766,7 @@
                 <w:color w:val="000000"/>
                 <w:sz w:val="19"/>
               </w:rPr>
-              <w:t>Read the referral and state the ethical question.</w:t>
+              <w:t>Open records, people, medical background, and policies in any order; divide them at a roundtable and report back.</w:t>
             </w:r>
           </w:p>
         </w:tc>
@@ -1798,7 +1798,7 @@
                 <w:color w:val="000000"/>
                 <w:sz w:val="19"/>
               </w:rPr>
-              <w:t>Initial issue statement and provisional view</w:t>
+              <w:t>Optional notes on each item</w:t>
             </w:r>
           </w:p>
         </w:tc>
@@ -1835,7 +1835,7 @@
                 <w:color w:val="000000"/>
                 <w:sz w:val="19"/>
               </w:rPr>
-              <w:t>2  Stakeholder inquiry</w:t>
+              <w:t>1  Framing</w:t>
             </w:r>
           </w:p>
         </w:tc>
@@ -1867,7 +1867,7 @@
                 <w:color w:val="000000"/>
                 <w:sz w:val="19"/>
               </w:rPr>
-              <w:t>Hear competing accounts and identify relevant values.</w:t>
+              <w:t>State the ethical question and a first view.</w:t>
             </w:r>
           </w:p>
         </w:tc>
@@ -1899,7 +1899,7 @@
                 <w:color w:val="000000"/>
                 <w:sz w:val="19"/>
               </w:rPr>
-              <w:t>Interview notes and stakeholder concerns</w:t>
+              <w:t>Issue statement and initial view</w:t>
             </w:r>
           </w:p>
         </w:tc>
@@ -1936,7 +1936,7 @@
                 <w:color w:val="000000"/>
                 <w:sz w:val="19"/>
               </w:rPr>
-              <w:t>3  Evidence and complication</w:t>
+              <w:t>2  Stakeholders and values</w:t>
             </w:r>
           </w:p>
         </w:tc>
@@ -1968,7 +1968,7 @@
                 <w:color w:val="000000"/>
                 <w:sz w:val="19"/>
               </w:rPr>
-              <w:t>Examine a new fact and reassess assumptions.</w:t>
+              <w:t>Identify whose interests matter and which values are in tension.</w:t>
             </w:r>
           </w:p>
         </w:tc>
@@ -2000,7 +2000,7 @@
                 <w:color w:val="000000"/>
                 <w:sz w:val="19"/>
               </w:rPr>
-              <w:t>Evidence interpretation and revision note</w:t>
+              <w:t>Stakeholder concerns and unresolved claims</w:t>
             </w:r>
           </w:p>
         </w:tc>
@@ -2037,7 +2037,7 @@
                 <w:color w:val="000000"/>
                 <w:sz w:val="19"/>
               </w:rPr>
-              <w:t>4  Ethical analysis</w:t>
+              <w:t>3  New information</w:t>
             </w:r>
           </w:p>
         </w:tc>
@@ -2069,7 +2069,7 @@
                 <w:color w:val="000000"/>
                 <w:sz w:val="19"/>
               </w:rPr>
-              <w:t>Apply concepts and compare feasible options.</w:t>
+              <w:t>Weigh what a later release adds and say whether it changes the recommendation or how to carry it out.</w:t>
             </w:r>
           </w:p>
         </w:tc>
@@ -2101,7 +2101,7 @@
                 <w:color w:val="000000"/>
                 <w:sz w:val="19"/>
               </w:rPr>
-              <w:t>Reasoned comparison and strongest objection</w:t>
+              <w:t>New-information note, with reasons for any change or for no change</w:t>
             </w:r>
           </w:p>
         </w:tc>
@@ -2138,7 +2138,7 @@
                 <w:color w:val="000000"/>
                 <w:sz w:val="19"/>
               </w:rPr>
-              <w:t>5  Recommendation</w:t>
+              <w:t>4  Analysis and recommendation</w:t>
             </w:r>
           </w:p>
         </w:tc>
@@ -2170,7 +2170,7 @@
                 <w:color w:val="000000"/>
                 <w:sz w:val="19"/>
               </w:rPr>
-              <w:t>Choose and justify an action or consultation process.</w:t>
+              <w:t>Compare feasible options, choose and justify one, and answer the strongest objection.</w:t>
             </w:r>
           </w:p>
         </w:tc>
@@ -2202,7 +2202,7 @@
                 <w:color w:val="000000"/>
                 <w:sz w:val="19"/>
               </w:rPr>
-              <w:t>Recommendation with conditions and next steps</w:t>
+              <w:t>Recommendation with objection, conditions, and next steps</w:t>
             </w:r>
           </w:p>
         </w:tc>
@@ -2239,7 +2239,7 @@
                 <w:color w:val="000000"/>
                 <w:sz w:val="19"/>
               </w:rPr>
-              <w:t>6  Debrief and reflection</w:t>
+              <w:t>5  Reflection</w:t>
             </w:r>
           </w:p>
         </w:tc>
@@ -2271,7 +2271,7 @@
                 <w:color w:val="000000"/>
                 <w:sz w:val="19"/>
               </w:rPr>
-              <w:t>Review the reasoning and explain what changed.</w:t>
+              <w:t>Review how the view developed and what remains uncertain.</w:t>
             </w:r>
           </w:p>
         </w:tc>
@@ -2319,17 +2319,17 @@
         <w:pStyle w:val="Heading2"/>
       </w:pPr>
       <w:r>
-        <w:t>Design the transitions</w:t>
+        <w:t>Design for free movement</w:t>
       </w:r>
     </w:p>
     <w:p>
       <w:r>
-        <w:t>Each transition should answer two questions: what has the student completed, and what will the next stage ask them to do? A short sentence can connect the stages: “You have heard the family’s account. Next, examine information that may affect how you interpret that account.” Avoid announcing the preferred interpretation before students have done the work.</w:t>
+        <w:t>Students move between the case file and the worksheet as their questions arise, so no section should depend on being reached in a particular order. Give each worksheet section a short introduction that says what to write and which kinds of item are likely to help. Avoid announcing the preferred interpretation before students have done the work.</w:t>
       </w:r>
     </w:p>
     <w:p>
       <w:r>
-        <w:t>Require only the responses that are necessary for the learning goals. If a written justification is missing, identify the field and explain the requirement next to it. Keep the student’s existing work. A completed stage should remain reviewable, and editing an earlier response should not silently erase later reasoning.</w:t>
+        <w:t>Require only the responses that are necessary for the learning goals. Opening case-file items is never required: the report should show whether students used the evidence, not whether they clicked it. Mark required worksheet answers clearly. The report page lists any that are missing, with a link to each. Keep the student’s existing work; editing one answer should never silently erase another.</w:t>
       </w:r>
     </w:p>
     <w:p>
@@ -2337,12 +2337,12 @@
         <w:pStyle w:val="Heading2"/>
       </w:pPr>
       <w:r>
-        <w:t>Use uncertainty deliberately</w:t>
+        <w:t>Release information deliberately</w:t>
       </w:r>
     </w:p>
     <w:p>
       <w:r>
-        <w:t>Do not release every fact at intake. Decide which facts students need to form an initial view and which can productively arrive later. A reveal should affect an ethical inference, such as whose account is credible or which option is feasible. Arbitrary surprises encourage guessing rather than careful inquiry.</w:t>
+        <w:t>Decide which items students need to form an initial view and which can arrive in a later release. Most later items should simply add to what students must consider: a new stakeholder, a document, a constraint of time or resources. Some can be designed to put pressure on an earlier inference, such as whose account is credible or which option is feasible. Vary this across cases so that students don’t learn to expect a twist. Arbitrary surprises encourage guessing rather than careful inquiry.</w:t>
       </w:r>
     </w:p>
     <w:p>
@@ -2355,7 +2355,7 @@
     </w:p>
     <w:p>
       <w:r>
-        <w:t>Finishing the simulation means producing a coherent account of the consultation. A sequence of clicks alone does not establish completion. The final stage should help students connect their initial view, stakeholder analysis, response to the reveal, and recommendation. Include an opportunity to name an unresolved question and identify what additional information would matter.</w:t>
+        <w:t>Finishing the simulation means producing a coherent account of the consultation. A sequence of clicks alone does not establish completion. The final worksheet section should help students connect their initial view, stakeholder analysis, response to new information, and recommendation. Include an opportunity to name an unresolved question and identify what additional information would matter.</w:t>
       </w:r>
     </w:p>
     <w:p>
@@ -2373,7 +2373,7 @@
     </w:p>
     <w:p>
       <w:r>
-        <w:t>The prototype baseline is a downloadable HTML simulation with JavaScript interactions. Its documented instructional elements include a six-stage case, stakeholder interviews, evidence reveals, student decisions, and a downloadable final report. These features define the minimum experience to preserve when the implementation changes.</w:t>
+        <w:t>The prototype baseline is a downloadable HTML simulation with JavaScript interactions. Its documented instructional elements were a six-stage case, stakeholder interviews, evidence reveals, student decisions, and a downloadable final report. The current engine keeps the interviews, decisions, and report, and replaces the fixed stages with a case file and worksheet. These features define the minimum experience to preserve when the implementation changes.</w:t>
       </w:r>
     </w:p>
     <w:p>
@@ -2796,7 +2796,7 @@
                 <w:color w:val="000000"/>
                 <w:sz w:val="19"/>
               </w:rPr>
-              <w:t>Stage changes, reveals, validation, report generation</w:t>
+              <w:t>Page changes, opened items, missing-answer checks, report generation</w:t>
             </w:r>
           </w:p>
         </w:tc>
@@ -2923,7 +2923,7 @@
     </w:p>
     <w:p>
       <w:r>
-        <w:t>For example, opening an interview records the stakeholder identifier as visited. Saving a reflection records the text under a stable prompt identifier. Revealing evidence records its identifier and preserves the earlier answer so that revision can be discussed. These are implementation patterns for the reusable engine, rather than required names for existing functions.</w:t>
+        <w:t>For example, opening a case-file item records its identifier as opened. Saving a reflection records the text under a stable prompt identifier. A later release adds items to the case file and preserves earlier answers so that any change of view can be discussed. These are implementation patterns for the reusable engine, rather than required names for existing functions.</w:t>
       </w:r>
     </w:p>
     <w:p>
@@ -2936,16 +2936,16 @@
     </w:p>
     <w:p>
       <w:r>
-        <w:t xml:space="preserve">The recorded usability correction added an obvious </w:t>
+        <w:t xml:space="preserve">The recorded usability correction added an obvious start button on the opening screen, now labeled </w:t>
       </w:r>
       <w:r>
         <w:rPr>
           <w:b/>
         </w:rPr>
-        <w:t>Start Consultation</w:t>
-      </w:r>
-      <w:r>
-        <w:t xml:space="preserve"> button on the opening screen. The earlier entry action was buried below a long intake form. Every future case should expose its first meaningful action immediately. Put optional details after the start action or collect them when they become relevant.</w:t>
+        <w:t>Open the case file</w:t>
+      </w:r>
+      <w:r>
+        <w:t>. The earlier entry action was buried below a long intake form. Every future case should expose its first meaningful action immediately. Put optional details after the start action or collect them when they become relevant.</w:t>
       </w:r>
     </w:p>
     <w:p>
@@ -2981,7 +2981,7 @@
     </w:p>
     <w:p>
       <w:r>
-        <w:t>The next architectural step is to separate case content from application behavior. A reusable engine should render different cases from a consistent data structure while retaining the six-stage learning sequence. The engine should not need a new set of navigation functions for each scenario.</w:t>
+        <w:t>The next architectural step is to separate case content from application behavior. A reusable engine should render different cases from a consistent data structure while keeping the case file and worksheet structure. The engine should not need a new set of navigation functions for each scenario.</w:t>
       </w:r>
     </w:p>
     <w:p>
@@ -3137,7 +3137,7 @@
                 <w:color w:val="000000"/>
                 <w:sz w:val="19"/>
               </w:rPr>
-              <w:t>id, version, title, audience, learningObjectives, referral, stageOrder</w:t>
+              <w:t>id, version, title, start, caseFile, items, worksheet, prompts, report, parts</w:t>
             </w:r>
           </w:p>
         </w:tc>
@@ -3174,7 +3174,7 @@
                 <w:color w:val="000000"/>
                 <w:sz w:val="19"/>
               </w:rPr>
-              <w:t>Stage</w:t>
+              <w:t>Case-file item</w:t>
             </w:r>
           </w:p>
         </w:tc>
@@ -3206,7 +3206,7 @@
                 <w:color w:val="000000"/>
                 <w:sz w:val="19"/>
               </w:rPr>
-              <w:t>id, title, introduction, prompts, requiredResponseIds, nextStageId</w:t>
+              <w:t>id, kind (record, person, background, policy), title, summary, source, sections, questions for people, limits, teaching notes</w:t>
             </w:r>
           </w:p>
         </w:tc>
@@ -3243,7 +3243,7 @@
                 <w:color w:val="000000"/>
                 <w:sz w:val="19"/>
               </w:rPr>
-              <w:t>Stakeholder</w:t>
+              <w:t>Worksheet section</w:t>
             </w:r>
           </w:p>
         </w:tc>
@@ -3275,7 +3275,7 @@
                 <w:color w:val="000000"/>
                 <w:sz w:val="19"/>
               </w:rPr>
-              <w:t>id, name, role, introduction, questions, answers, teachingNotes</w:t>
+              <w:t>id, title, introduction, blocks (text, prompts, items, carryForward, trajectory, perspectives)</w:t>
             </w:r>
           </w:p>
         </w:tc>
@@ -3312,7 +3312,7 @@
                 <w:color w:val="000000"/>
                 <w:sz w:val="19"/>
               </w:rPr>
-              <w:t>Evidence item</w:t>
+              <w:t>Part</w:t>
             </w:r>
           </w:p>
         </w:tc>
@@ -3344,7 +3344,7 @@
                 <w:color w:val="000000"/>
                 <w:sz w:val="19"/>
               </w:rPr>
-              <w:t>id, title, content, availableAtStage, sourceLabel, debriefNotes</w:t>
+              <w:t>id, label, file, items released, worksheet sections, start, end, report</w:t>
             </w:r>
           </w:p>
         </w:tc>
@@ -3413,7 +3413,7 @@
                 <w:color w:val="000000"/>
                 <w:sz w:val="19"/>
               </w:rPr>
-              <w:t>id, question, options, rationalePrompt, feedbackRule</w:t>
+              <w:t>id, type, label, options, required or requiredIf, restateLabel</w:t>
             </w:r>
           </w:p>
         </w:tc>
@@ -3482,7 +3482,7 @@
                 <w:color w:val="000000"/>
                 <w:sz w:val="19"/>
               </w:rPr>
-              <w:t>sections, responseIds, revisionPairs, reflectionPrompts</w:t>
+              <w:t>title, filename, sections of prompt identifiers, earlier-part flags</w:t>
             </w:r>
           </w:p>
         </w:tc>
@@ -3503,12 +3503,12 @@
     </w:p>
     <w:p>
       <w:r>
-        <w:t>Keep the case identifier and version, current stage, completed stages, visited interviews, revealed evidence, selected options, written responses, and revision history. Use stable identifiers rather than visible titles as keys. A title can change without breaking saved answers or export mappings.</w:t>
+        <w:t>Keep the case identifier and version, the current view, opened case-file items, selected options, written responses, and any restated answers. Use stable identifiers rather than visible titles as keys. A title can change without breaking saved answers or export mappings.</w:t>
       </w:r>
     </w:p>
     <w:p>
       <w:r>
-        <w:t>Represent the initial answer and revised answer as separate values. If the application stores only the newest text, it cannot later show how a student’s judgment developed. Make the meaning of “complete” explicit for each stage and compute it from the required responses.</w:t>
+        <w:t>Represent the initial answer and revised answer as separate values. If the application stores only the newest text, it cannot later show how a student’s judgment developed. Make the meaning of “complete” explicit for each worksheet section and compute it from the required responses.</w:t>
       </w:r>
     </w:p>
     <w:p>
@@ -3540,7 +3540,7 @@
         <w:pStyle w:val="ListBullet"/>
       </w:pPr>
       <w:r>
-        <w:t>A stage renderer displays content using shared components and accessible controls.</w:t>
+        <w:t>A view renderer displays the case file, items, worksheet sections, and report using shared components and accessible controls.</w:t>
       </w:r>
     </w:p>
     <w:p>
@@ -3548,7 +3548,7 @@
         <w:pStyle w:val="ListBullet"/>
       </w:pPr>
       <w:r>
-        <w:t>A navigation controller checks stage requirements and supports returning to prior work.</w:t>
+        <w:t>A navigation controller shows each worksheet section’s status, lists missing required answers, and supports moving freely between areas.</w:t>
       </w:r>
     </w:p>
     <w:p>
@@ -4559,12 +4559,12 @@
     </w:p>
     <w:p>
       <w:r>
-        <w:t>Use a centered reading area with a visible case title and stage heading. On larger screens, a progress column can sit beside the active content. On small screens, move progress above the content and keep the primary action easy to find. Preserve a logical reading order when the layout collapses.</w:t>
+        <w:t>Use a centered reading area with a visible case title and page heading. On larger screens, a navigation column can sit beside the active content. On small screens, move navigation above the content and keep the primary action easy to find. Preserve a logical reading order when the layout collapses.</w:t>
       </w:r>
     </w:p>
     <w:p>
       <w:r>
-        <w:t>Give recurring components the same appearance and behavior: stakeholder cards open interviews; evidence cards identify the new information; response fields include their prompt and requirement; action rows identify the next step. Reserve visual emphasis for the task students need to complete.</w:t>
+        <w:t>Give recurring components the same appearance and behavior: case-file tiles show a number, kind, title, and whether they have been opened; people open into interview questions; new items carry a New label; response fields include their prompt and requirement; action rows identify the next step. Reserve visual emphasis for the task students need to complete.</w:t>
       </w:r>
     </w:p>
     <w:p>
@@ -4611,7 +4611,7 @@
         <w:pStyle w:val="ListBullet"/>
       </w:pPr>
       <w:r>
-        <w:t>Show the case purpose, expected work, and a clearly visible Start Consultation button before any long form.</w:t>
+        <w:t>Show the case purpose, expected work, and a clearly visible Open the case file button before any long text.</w:t>
       </w:r>
     </w:p>
     <w:p>
@@ -4619,7 +4619,7 @@
         <w:pStyle w:val="ListBullet"/>
       </w:pPr>
       <w:r>
-        <w:t>Display the current stage in text and show the six-stage sequence without relying on color.</w:t>
+        <w:t>Display the current area and section in text, and show each worksheet section’s status without relying on color.</w:t>
       </w:r>
     </w:p>
     <w:p>
@@ -4627,7 +4627,7 @@
         <w:pStyle w:val="ListBullet"/>
       </w:pPr>
       <w:r>
-        <w:t>Use descriptive actions such as Continue to Ethical Analysis rather than unexplained arrows.</w:t>
+        <w:t>Use descriptive actions such as Next: Recommendation or Back to the case file rather than unexplained arrows.</w:t>
       </w:r>
     </w:p>
     <w:p>
@@ -4635,7 +4635,7 @@
         <w:pStyle w:val="ListBullet"/>
       </w:pPr>
       <w:r>
-        <w:t>Allow students to review completed work and preserve responses when they move between stages.</w:t>
+        <w:t>Let students move between the case file and the worksheet at any time without losing responses.</w:t>
       </w:r>
     </w:p>
     <w:p>
@@ -4666,7 +4666,7 @@
     </w:p>
     <w:p>
       <w:r>
-        <w:t>Keep a visible focus indicator on every interactive element. Use a logical heading hierarchy and tab order. When a new stage replaces the old one, move focus to its heading or another meaningful starting point. Give dynamic completion and download feedback a concise accessible announcement.</w:t>
+        <w:t>Keep a visible focus indicator on every interactive element. Use a logical heading hierarchy and tab order. When a new page replaces the old one, move focus to its heading or another meaningful starting point. Give dynamic completion and download feedback a concise accessible announcement.</w:t>
       </w:r>
     </w:p>
     <w:p>
@@ -4762,12 +4762,12 @@
         <w:pStyle w:val="Heading2"/>
       </w:pPr>
       <w:r>
-        <w:t>Step 4 Plan the six stages</w:t>
+        <w:t>Step 4 Plan the case file and worksheet</w:t>
       </w:r>
     </w:p>
     <w:p>
       <w:r>
-        <w:t>Draft the prompt and saved artifact for every stage. Write the initial position prompt before the reveal and the revision prompt after it. Decide which interviews are required and why. Ensure that students encounter the evidence they need before making the final recommendation.</w:t>
+        <w:t>List every case-file item, its kind, and the release it belongs to. Include a medical background item for each condition or treatment students must understand. Draft the prompt and saved answer for every worksheet section. Write the initial position prompt for the first release and a new-information prompt for any later one. Make sure students can find what they need before making the final recommendation.</w:t>
       </w:r>
     </w:p>
     <w:p>
@@ -4775,12 +4775,12 @@
         <w:pStyle w:val="Heading2"/>
       </w:pPr>
       <w:r>
-        <w:t>Step 5 Write the complication</w:t>
+        <w:t>Step 5 Write the new information</w:t>
       </w:r>
     </w:p>
     <w:p>
       <w:r>
-        <w:t>Choose a reveal that changes a relevant fact, interpretation, or constraint. Explain in the author notes exactly which earlier inference it should put under pressure. A useful reveal gives students a reason to reconsider; it need not force everyone toward the same conclusion.</w:t>
+        <w:t>Decide what a later release adds and why it matters: a new person, a document, a policy, a changed constraint. Most new information should add to what students weigh rather than overturn it. When an item is meant to put an earlier inference under pressure, say which one in the author notes. A useful release gives students more to consider; it need not push anyone toward the same conclusion.</w:t>
       </w:r>
     </w:p>
     <w:p>
@@ -4819,7 +4819,7 @@
         <w:pStyle w:val="Heading1"/>
       </w:pPr>
       <w:r>
-        <w:t>08 Stakeholders and evidence reveals</w:t>
+        <w:t>08 Case file items and new information</w:t>
       </w:r>
     </w:p>
     <w:p>
@@ -5359,7 +5359,65 @@
         <w:pStyle w:val="Heading2"/>
       </w:pPr>
       <w:r>
-        <w:t>Design an evidence reveal</w:t>
+        <w:t>Write medical background items</w:t>
+      </w:r>
+    </w:p>
+    <w:p>
+      <w:r>
+        <w:t>Give every condition or treatment the case depends on its own plain-language item, such as Alzheimer’s disease, a persistent vegetative state, or tube feeding. Write for a student with no clinical training: short sentences, everyday words, and an explanation of any necessary term the first time it appears. Suggested sections:</w:t>
+      </w:r>
+    </w:p>
+    <w:p>
+      <w:pPr>
+        <w:pStyle w:val="ListBullet"/>
+      </w:pPr>
+      <w:r>
+        <w:t>What it is, in one or two sentences.</w:t>
+      </w:r>
+    </w:p>
+    <w:p>
+      <w:pPr>
+        <w:pStyle w:val="ListBullet"/>
+      </w:pPr>
+      <w:r>
+        <w:t>What it’s like day to day, for the person and for the people caring for them.</w:t>
+      </w:r>
+    </w:p>
+    <w:p>
+      <w:pPr>
+        <w:pStyle w:val="ListBullet"/>
+      </w:pPr>
+      <w:r>
+        <w:t>What treatment can and can’t do, including the treatment at issue in the case.</w:t>
+      </w:r>
+    </w:p>
+    <w:p>
+      <w:pPr>
+        <w:pStyle w:val="ListBullet"/>
+      </w:pPr>
+      <w:r>
+        <w:t>What usually happens over time, and how certain anyone can be.</w:t>
+      </w:r>
+    </w:p>
+    <w:p>
+      <w:pPr>
+        <w:pStyle w:val="ListBullet"/>
+      </w:pPr>
+      <w:r>
+        <w:t>Common misunderstandings that students are likely to bring with them.</w:t>
+      </w:r>
+    </w:p>
+    <w:p>
+      <w:r>
+        <w:t>Give only the medical facts students need to follow the case, and don’t use a background item to settle the ethical question. Have a clinician check every background item before release, and record who checked it and when in the author notes.</w:t>
+      </w:r>
+    </w:p>
+    <w:p>
+      <w:pPr>
+        <w:pStyle w:val="Heading2"/>
+      </w:pPr>
+      <w:r>
+        <w:t>Plan a release of new information</w:t>
       </w:r>
     </w:p>
     <w:p>
@@ -5371,7 +5429,7 @@
         </w:numPr>
       </w:pPr>
       <w:r>
-        <w:t>Identify the earlier assumption or inference that the evidence may affect.</w:t>
+        <w:t>Decide what the new item adds: another perspective, a fact, a constraint, or a challenge to an earlier inference.</w:t>
       </w:r>
     </w:p>
     <w:p>
@@ -5383,7 +5441,7 @@
         </w:numPr>
       </w:pPr>
       <w:r>
-        <w:t>Specify the evidence source inside the fictional case and its limits.</w:t>
+        <w:t>Specify the item’s source inside the fictional case and its limits.</w:t>
       </w:r>
     </w:p>
     <w:p>
@@ -5407,7 +5465,7 @@
         </w:numPr>
       </w:pPr>
       <w:r>
-        <w:t>Ask students what changed, what did not, and what remains uncertain.</w:t>
+        <w:t>Ask whether the new information changes the recommendation or how it would be carried out, and make clear that keeping a view, with reasons, is as acceptable as changing it.</w:t>
       </w:r>
     </w:p>
     <w:p>
@@ -5419,7 +5477,7 @@
         </w:numPr>
       </w:pPr>
       <w:r>
-        <w:t>Record the reveal and revision in the report without overwriting the earlier response.</w:t>
+        <w:t>Record the earlier and later responses separately in the report.</w:t>
       </w:r>
     </w:p>
     <w:p>
@@ -5427,12 +5485,12 @@
         <w:pStyle w:val="Heading2"/>
       </w:pPr>
       <w:r>
-        <w:t>Pace reveals with successive access codes</w:t>
+        <w:t>Pace releases with successive access codes</w:t>
       </w:r>
     </w:p>
     <w:p>
       <w:r>
-        <w:t xml:space="preserve">When the whole class should meet a reveal at the same moment, publish the case on the course website as successive parts, each encrypted with its own access code. Part 1 runs through the commitment the reveal will test, such as the provisional recommendation. Part 2 opens with the new evidence. Announce the Part 2 code when you want the reveal to land, ideally after a short discussion of provisional views. This gives the instructor control over timing without a dashboard, server, or accounts.</w:t>
+        <w:t>When the whole class should meet new information at the same moment, publish the case on the course website as successive parts, each encrypted with its own access code. Part 1 runs through the commitment the new information will test, such as the provisional recommendation. Part 2 opens with new items at the top of the case file, marked New, alongside everything from Part 1. Announce the Part 2 code when you want the new information to arrive, ideally after a short discussion of provisional views. This gives the instructor control over timing without a dashboard, server, or accounts.</w:t>
       </w:r>
     </w:p>
     <w:p>
@@ -5440,7 +5498,7 @@
         <w:pStyle w:val="ListBullet"/>
       </w:pPr>
       <w:r>
-        <w:t xml:space="preserve">Split only at a commitment point. Each part should end once students have recorded the view the next reveal puts under pressure.</w:t>
+        <w:t>Split only at a commitment point. Each part should end once students have recorded the view the next release asks them to reconsider.</w:t>
       </w:r>
     </w:p>
     <w:p>
@@ -5477,7 +5535,7 @@
     </w:p>
     <w:p>
       <w:r>
-        <w:t xml:space="preserve">Either way, the final report must still show the initial and revised responses separately.</w:t>
+        <w:t>Either way, the final report must still show the earlier and later responses separately.</w:t>
       </w:r>
     </w:p>
     <w:p>
@@ -5870,7 +5928,7 @@
                 <w:color w:val="000000"/>
                 <w:sz w:val="19"/>
               </w:rPr>
-              <w:t>Evidence and revision</w:t>
+              <w:t>New information</w:t>
             </w:r>
           </w:p>
         </w:tc>
@@ -5902,7 +5960,7 @@
                 <w:color w:val="000000"/>
                 <w:sz w:val="19"/>
               </w:rPr>
-              <w:t>New information, its interpretation, and any change of view</w:t>
+              <w:t>What the new items add, how they were weighed, and whether the view changed</w:t>
             </w:r>
           </w:p>
         </w:tc>
@@ -6084,7 +6142,7 @@
     </w:p>
     <w:p>
       <w:r>
-        <w:t>Introduce ETHOS as a structured consultation exercise. Explain the learning goals, the final report, and how reasoning will be assessed before students begin. Demonstrate the start action and one navigation step, then allow students to encounter the ethical problem without previewing the reveal.</w:t>
+        <w:t>Introduce ETHOS as a structured consultation exercise. Explain the learning goals, the final report, and how reasoning will be assessed before students begin. Demonstrate the start action and one navigation step, then allow students to encounter the ethical problem without previewing later releases.</w:t>
       </w:r>
     </w:p>
     <w:p>
@@ -6342,7 +6400,7 @@
                 <w:color w:val="000000"/>
                 <w:sz w:val="19"/>
               </w:rPr>
-              <w:t>8–18 min</w:t>
+              <w:t>8–25 min</w:t>
             </w:r>
           </w:p>
         </w:tc>
@@ -6374,7 +6432,7 @@
                 <w:color w:val="000000"/>
                 <w:sz w:val="19"/>
               </w:rPr>
-              <w:t>Intake and initial position</w:t>
+              <w:t>Case file roundtable and initial view</w:t>
             </w:r>
           </w:p>
         </w:tc>
@@ -6406,7 +6464,7 @@
                 <w:color w:val="000000"/>
                 <w:sz w:val="19"/>
               </w:rPr>
-              <w:t>Check that teams have framed a specific ethical question.</w:t>
+              <w:t>Teams divide the items and report back. Ask whose account or concern has been overlooked.</w:t>
             </w:r>
           </w:p>
         </w:tc>
@@ -6443,7 +6501,7 @@
                 <w:color w:val="000000"/>
                 <w:sz w:val="19"/>
               </w:rPr>
-              <w:t>18–35 min</w:t>
+              <w:t>25–35 min</w:t>
             </w:r>
           </w:p>
         </w:tc>
@@ -6475,7 +6533,7 @@
                 <w:color w:val="000000"/>
                 <w:sz w:val="19"/>
               </w:rPr>
-              <w:t>Stakeholder inquiry and evidence</w:t>
+              <w:t>New information (Part 2 code)</w:t>
             </w:r>
           </w:p>
         </w:tc>
@@ -6507,7 +6565,7 @@
                 <w:color w:val="000000"/>
                 <w:sz w:val="19"/>
               </w:rPr>
-              <w:t>Ask whose account or concern has been overlooked.</w:t>
+              <w:t>After a brief discussion of provisional views, release the next code. Ask what the new items add and whether it matters.</w:t>
             </w:r>
           </w:p>
         </w:tc>
@@ -6831,7 +6889,7 @@
     </w:p>
     <w:p>
       <w:r>
-        <w:t>For teams of three or four, assign a facilitator, an evidence recorder, an objection reviewer, and, when useful, a report editor. The facilitator keeps the group on task; the recorder distinguishes facts from interpretations; the reviewer tests the preferred recommendation. Rotate roles across cases so that one student does not always control the interface or write the final response.</w:t>
+        <w:t>For teams of three or four, divide the case file so that each member reads different items first and reports back, as at a consultation roundtable. Also assign a facilitator, an evidence recorder, an objection reviewer, and, when useful, a report editor. The facilitator keeps the group on task; the recorder distinguishes facts from interpretations; the reviewer tests the preferred recommendation. Rotate roles and item assignments across cases so that one student does not always control the interface or write the final response.</w:t>
       </w:r>
     </w:p>
     <w:p>
@@ -6879,7 +6937,7 @@
         <w:pStyle w:val="ListBullet"/>
       </w:pPr>
       <w:r>
-        <w:t>What changed after the reveal, and what would justify changing your view again?</w:t>
+        <w:t>What did the new information add, and does it change your recommendation or only how you would carry it out?</w:t>
       </w:r>
     </w:p>
     <w:p>
@@ -6897,7 +6955,7 @@
     </w:p>
     <w:p>
       <w:r>
-        <w:t>For a shorter class, assign intake beforehand and reserve class time for inquiry and revision. For asynchronous work, require an individual initial response before group discussion. Confirm that every student can access the file and retain their report. Keep a readable case transcript and response worksheet available as an alternative if the interactive file cannot run.</w:t>
+        <w:t>For a shorter class, assign the first case-file reading beforehand and reserve class time for discussion and the worksheet. For asynchronous work, require an individual initial response before group discussion. Confirm that every student can access the file and retain their report. Keep a readable case transcript and response worksheet available as an alternative if the interactive file cannot run.</w:t>
       </w:r>
     </w:p>
     <w:p>
@@ -7274,7 +7332,7 @@
                 <w:color w:val="000000"/>
                 <w:sz w:val="19"/>
               </w:rPr>
-              <w:t>Evidence and revision</w:t>
+              <w:t>Integrating new information</w:t>
             </w:r>
           </w:p>
         </w:tc>
@@ -7338,7 +7396,7 @@
                 <w:color w:val="000000"/>
                 <w:sz w:val="19"/>
               </w:rPr>
-              <w:t>Uses case evidence carefully, identifies assumptions, and explains the effect of the reveal.</w:t>
+              <w:t>Uses case evidence carefully, identifies assumptions, and explains whether and how new information affects the recommendation.</w:t>
             </w:r>
           </w:p>
         </w:tc>
@@ -7675,7 +7733,7 @@
     </w:p>
     <w:p>
       <w:r>
-        <w:t>A student who names autonomy but never connects it to a person’s expressed priorities has not yet demonstrated application. A student who changes a recommendation without explaining why has not yet demonstrated reflective revision. Conversely, retaining an initial recommendation can show strong reasoning when the student explains why the reveal does not defeat the original reasons.</w:t>
+        <w:t>A student who names autonomy but never connects it to a person’s expressed priorities has not yet demonstrated application. A student who changes a recommendation without explaining why has not yet demonstrated reflective revision. Conversely, retaining an initial recommendation can show strong reasoning when the student explains why the new information does not defeat the original reasons.</w:t>
       </w:r>
     </w:p>
     <w:p>
@@ -7759,17 +7817,17 @@
         <w:t>[observable outcomes]</w:t>
       </w:r>
       <w:r>
-        <w:t>. Students will complete a six-stage consultation and retain a final report explaining their reasoning. Use fictional case content supplied by the author; do not invent clinical facts, institutional policies, or stakeholder testimony.</w:t>
+        <w:t>. Students will work through a case file and worksheet and retain a final report explaining their reasoning. Use fictional case content supplied by the author; do not invent clinical facts, institutional policies, or stakeholder testimony.</w:t>
       </w:r>
     </w:p>
     <w:p>
       <w:r>
-        <w:t>Preserve these six functions: intake and ethical framing; stakeholder inquiry; evidence and complication; ethical analysis; recommendation; debrief and reflection. Use the approved stage labels. Provide a visible Start Consultation button on the opening screen, a progress display, clear instructions, and a named next action at every stage.</w:t>
+        <w:t>Preserve the two areas: a case file of numbered items (records and documents, people involved, plain-language medical background, and policies, codes and law) that students open in any order, and a worksheet of written sections they answer in any order. Use the approved section labels. Provide a visible Open the case file button on the opening screen, a navigation column showing each section’s status, clear instructions, and a named next action on every page.</w:t>
       </w:r>
     </w:p>
     <w:p>
       <w:r>
-        <w:t>Implement stakeholder interviews, the planned evidence reveals, and the approved decision prompts. Require written reasons where specified. Preserve initial and revised responses separately. Allow review of completed stages without losing answers. Validate required fields with accessible, specific messages and retain the student’s work after a validation error.</w:t>
+        <w:t>Implement interview questions for people, the planned releases of new information, and the approved decision prompts. Require written reasons where specified. Preserve earlier and later responses separately. Let students move between areas without losing answers. List missing required answers on the report page with a link to each, and keep the student’s work.</w:t>
       </w:r>
     </w:p>
     <w:p>
@@ -7815,12 +7873,12 @@
         <w:t>[approved theme or reference]</w:t>
       </w:r>
       <w:r>
-        <w:t xml:space="preserve"> for typography, color, spacing, and components. Keep text readable, controls visible, and layout usable on narrow screens. Use semantic controls and headings, persistent labels, keyboard access, visible focus, and meaningful focus placement after stage transitions. Do not encode required meaning through color alone.</w:t>
+        <w:t xml:space="preserve"> for typography, color, spacing, and components. Keep text readable, controls visible, and layout usable on narrow screens. Use semantic controls and headings, persistent labels, keyboard access, visible focus, and meaningful focus placement after moving between pages. Do not encode required meaning through color alone.</w:t>
       </w:r>
     </w:p>
     <w:p>
       <w:r>
-        <w:t xml:space="preserve">Generate a reviewable consultation report containing the ethical question, initial position, stakeholder concerns, evidence interpretation, revisions, alternatives, recommendation, objection and response, conditions, and reflection. The required export format is </w:t>
+        <w:t xml:space="preserve">Generate a reviewable consultation report containing the ethical question, initial position, stakeholder concerns, response to new information, any revisions, alternatives, recommendation, objection and response, conditions, and reflection. The required export format is </w:t>
       </w:r>
       <w:r>
         <w:rPr>
@@ -7842,7 +7900,7 @@
     </w:p>
     <w:p>
       <w:r>
-        <w:t>Deliver the working files, a concise feature inventory, instructor launch instructions, and a record of completed checks. Demonstrate a full six-stage run, earlier-stage review, missing-field recovery, a narrow-screen run, keyboard completion, and a successful report export. Verify reload behavior if persistence is included. Identify remaining defects or unimplemented features explicitly.</w:t>
+        <w:t>Deliver the working files, a concise feature inventory, instructor launch instructions, and a record of completed checks. Demonstrate a full run through the case file and worksheet, free movement between areas, missing-field recovery, a narrow-screen run, keyboard completion, and a successful report export. Verify reload behavior if persistence is included. Identify remaining defects or unimplemented features explicitly.</w:t>
       </w:r>
     </w:p>
     <w:p>
@@ -8032,7 +8090,7 @@
         <w:spacing w:line="240" w:lineRule="auto" w:after="80" w:before="120"/>
       </w:pPr>
       <w:r>
-        <w:t>Stage planning record</w:t>
+        <w:t>Worksheet section record</w:t>
       </w:r>
     </w:p>
     <w:p>
@@ -8043,7 +8101,7 @@
         <w:rPr>
           <w:sz w:val="20"/>
         </w:rPr>
-        <w:t>Repeat this record for all six stages.</w:t>
+        <w:t>Repeat this record for each worksheet section.</w:t>
         <w:br/>
       </w:r>
       <w:r>
@@ -8051,7 +8109,7 @@
           <w:b/>
           <w:sz w:val="20"/>
         </w:rPr>
-        <w:t>Stage ID and title:</w:t>
+        <w:t>Section ID and title:</w:t>
       </w:r>
       <w:r>
         <w:rPr>
@@ -8079,13 +8137,13 @@
           <w:b/>
           <w:sz w:val="20"/>
         </w:rPr>
-        <w:t>Content shown:</w:t>
+        <w:t>Case-file items it draws on:</w:t>
       </w:r>
       <w:r>
         <w:rPr>
           <w:sz w:val="20"/>
         </w:rPr>
-        <w:t xml:space="preserve"> [referral, interview, evidence, or instructions]</w:t>
+        <w:t xml:space="preserve"> [ ]</w:t>
         <w:br/>
       </w:r>
       <w:r>
@@ -8107,7 +8165,7 @@
           <w:b/>
           <w:sz w:val="20"/>
         </w:rPr>
-        <w:t>Required completion evidence:</w:t>
+        <w:t>Required answers:</w:t>
       </w:r>
       <w:r>
         <w:rPr>
@@ -8122,20 +8180,6 @@
           <w:sz w:val="20"/>
         </w:rPr>
         <w:t>What is saved for the report:</w:t>
-      </w:r>
-      <w:r>
-        <w:rPr>
-          <w:sz w:val="20"/>
-        </w:rPr>
-        <w:t xml:space="preserve"> [ ]</w:t>
-        <w:br/>
-      </w:r>
-      <w:r>
-        <w:rPr>
-          <w:b/>
-          <w:sz w:val="20"/>
-        </w:rPr>
-        <w:t>Transition to the next stage:</w:t>
       </w:r>
       <w:r>
         <w:rPr>
@@ -8164,7 +8208,7 @@
         <w:spacing w:line="240" w:lineRule="auto" w:after="80" w:before="120"/>
       </w:pPr>
       <w:r>
-        <w:t>Stakeholder and reveal records</w:t>
+        <w:t>Case-file item records</w:t>
       </w:r>
     </w:p>
     <w:p>
@@ -8252,29 +8296,24 @@
       </w:pPr>
       <w:r>
         <w:rPr>
+          <w:b/>
           <w:sz w:val="20"/>
         </w:rPr>
+        <w:t>Item ID, kind, and release:</w:t>
+      </w:r>
+      <w:r>
+        <w:rPr>
+          <w:sz w:val="20"/>
+        </w:rPr>
+        <w:t xml:space="preserve"> [ ] (Part 1, or a later coded part)</w:t>
+        <w:br/>
       </w:r>
       <w:r>
         <w:rPr>
           <w:b/>
           <w:sz w:val="20"/>
         </w:rPr>
-        <w:t>Evidence ID, release stage, and release method:</w:t>
-      </w:r>
-      <w:r>
-        <w:rPr>
-          <w:sz w:val="20"/>
-        </w:rPr>
-        <w:t xml:space="preserve"> [ ] (within one file, or a separately coded part)</w:t>
-        <w:br/>
-      </w:r>
-      <w:r>
-        <w:rPr>
-          <w:b/>
-          <w:sz w:val="20"/>
-        </w:rPr>
-        <w:t>Evidence content and fictional source:</w:t>
+        <w:t>Content and fictional source:</w:t>
       </w:r>
       <w:r>
         <w:rPr>
@@ -8288,7 +8327,7 @@
           <w:b/>
           <w:sz w:val="20"/>
         </w:rPr>
-        <w:t>Earlier assumption affected:</w:t>
+        <w:t>What it adds to the case:</w:t>
       </w:r>
       <w:r>
         <w:rPr>
@@ -8302,7 +8341,7 @@
           <w:b/>
           <w:sz w:val="20"/>
         </w:rPr>
-        <w:t>Student revision prompt and saved response IDs:</w:t>
+        <w:t>Student prompt and saved response IDs:</w:t>
       </w:r>
       <w:r>
         <w:rPr>
@@ -8316,7 +8355,67 @@
           <w:b/>
           <w:sz w:val="20"/>
         </w:rPr>
-        <w:t>Interpretive limits and debrief points:</w:t>
+        <w:t>Limits and debrief points:</w:t>
+      </w:r>
+      <w:r>
+        <w:rPr>
+          <w:sz w:val="20"/>
+        </w:rPr>
+        <w:t xml:space="preserve"> [ ]</w:t>
+      </w:r>
+    </w:p>
+    <w:p>
+      <w:pPr>
+        <w:spacing w:line="240" w:lineRule="auto" w:after="80"/>
+      </w:pPr>
+      <w:r>
+        <w:rPr>
+          <w:b/>
+          <w:sz w:val="20"/>
+        </w:rPr>
+        <w:t>Medical background ID and condition:</w:t>
+      </w:r>
+      <w:r>
+        <w:rPr>
+          <w:sz w:val="20"/>
+        </w:rPr>
+        <w:t xml:space="preserve"> [ ]</w:t>
+        <w:br/>
+      </w:r>
+      <w:r>
+        <w:rPr>
+          <w:b/>
+          <w:sz w:val="20"/>
+        </w:rPr>
+        <w:t>Plain-language sections:</w:t>
+      </w:r>
+      <w:r>
+        <w:rPr>
+          <w:sz w:val="20"/>
+        </w:rPr>
+        <w:t xml:space="preserve"> [what it is; day to day; what treatment can and can’t do; course over time; common misunderstandings]</w:t>
+        <w:br/>
+      </w:r>
+      <w:r>
+        <w:rPr>
+          <w:b/>
+          <w:sz w:val="20"/>
+        </w:rPr>
+        <w:t>Facts the case depends on:</w:t>
+      </w:r>
+      <w:r>
+        <w:rPr>
+          <w:sz w:val="20"/>
+        </w:rPr>
+        <w:t xml:space="preserve"> [ ]</w:t>
+        <w:br/>
+      </w:r>
+      <w:r>
+        <w:rPr>
+          <w:b/>
+          <w:sz w:val="20"/>
+        </w:rPr>
+        <w:t>Clinical reviewer and date:</w:t>
       </w:r>
       <w:r>
         <w:rPr>
@@ -8591,7 +8690,7 @@
         </w:numPr>
       </w:pPr>
       <w:r>
-        <w:t>Observe a specific difficulty, such as students missing the start action or overlooking a stakeholder concern.</w:t>
+        <w:t>Observe a specific difficulty, such as students missing the start action or overlooking a case-file item.</w:t>
       </w:r>
     </w:p>
     <w:p>
@@ -8655,7 +8754,7 @@
         <w:pStyle w:val="ListBullet"/>
       </w:pPr>
       <w:r>
-        <w:t>The opening screen exposes Start Consultation, and the full six-stage route can be completed.</w:t>
+        <w:t>The opening screen exposes Open the case file, every case-file item opens, and every worksheet section can be completed in any order.</w:t>
       </w:r>
     </w:p>
     <w:p>
@@ -8671,7 +8770,7 @@
         <w:pStyle w:val="ListBullet"/>
       </w:pPr>
       <w:r>
-        <w:t>Interviews and evidence appear at the intended point; back navigation preserves answers.</w:t>
+        <w:t>Each item appears in the intended release, later releases are marked New, and moving between areas preserves answers.</w:t>
       </w:r>
     </w:p>
     <w:p>
@@ -8687,7 +8786,7 @@
         <w:pStyle w:val="ListBullet"/>
       </w:pPr>
       <w:r>
-        <w:t>Initial and revised responses remain distinguishable in the final report.</w:t>
+        <w:t>Earlier and later responses remain distinguishable in the final report.</w:t>
       </w:r>
     </w:p>
     <w:p>
@@ -8727,7 +8826,15 @@
         <w:pStyle w:val="ListBullet"/>
       </w:pPr>
       <w:r>
-        <w:t>Options have defensible reasons; the reveal changes a relevant inference; feedback avoids an unsupported single moral answer.</w:t>
+        <w:t>Options have defensible reasons; new information is worth weighing and the prompt accepts a reasoned decision not to change; feedback avoids an unsupported single moral answer.</w:t>
+      </w:r>
+    </w:p>
+    <w:p>
+      <w:pPr>
+        <w:pStyle w:val="ListBullet"/>
+      </w:pPr>
+      <w:r>
+        <w:t>Each medical background item is in plain language and has been checked by a clinician.</w:t>
       </w:r>
     </w:p>
     <w:p>

</xml_diff>

<commit_message>
Organize cases around the six-step method
The navigation column can list the six steps students use to solve
cases, with the case file as step 2. Students list their own options
with likely consequences (step 3), add arguments for and against each
(step 4), and choose from their own list (step 5); the case's options
appear only afterward. Step 6 is an action plan, with an optional
follow-up part to assess consequences. Manual, rubric, and READMEs
updated to match.

Co-Authored-By: Claude Opus 5.5 <noreply@anthropic.com>
Claude-Session: https://claude.ai/code/session_01UAtA3GmVs4fdgvH26R4rvY
</commit_message>
<xml_diff>
--- a/planning/ETHOS_Bioethics_Simulator_Design_and_Iteration_Manual.docx
+++ b/planning/ETHOS_Bioethics_Simulator_Design_and_Iteration_Manual.docx
@@ -231,7 +231,7 @@
                 <w:color w:val="000000"/>
                 <w:sz w:val="18"/>
               </w:rPr>
-              <w:t>Case file and worksheet structure</w:t>
+              <w:t>The six steps in a case</w:t>
             </w:r>
           </w:p>
         </w:tc>
@@ -263,7 +263,7 @@
                 <w:color w:val="000000"/>
                 <w:sz w:val="18"/>
               </w:rPr>
-              <w:t>3</w:t>
+              <w:t>4</w:t>
             </w:r>
           </w:p>
         </w:tc>
@@ -332,7 +332,7 @@
                 <w:color w:val="000000"/>
                 <w:sz w:val="18"/>
               </w:rPr>
-              <w:t>4</w:t>
+              <w:t>5</w:t>
             </w:r>
           </w:p>
         </w:tc>
@@ -401,7 +401,7 @@
                 <w:color w:val="000000"/>
                 <w:sz w:val="18"/>
               </w:rPr>
-              <w:t>5</w:t>
+              <w:t>6</w:t>
             </w:r>
           </w:p>
         </w:tc>
@@ -470,7 +470,7 @@
                 <w:color w:val="000000"/>
                 <w:sz w:val="18"/>
               </w:rPr>
-              <w:t>6</w:t>
+              <w:t>7</w:t>
             </w:r>
           </w:p>
         </w:tc>
@@ -539,7 +539,7 @@
                 <w:color w:val="000000"/>
                 <w:sz w:val="18"/>
               </w:rPr>
-              <w:t>7</w:t>
+              <w:t>8</w:t>
             </w:r>
           </w:p>
         </w:tc>
@@ -608,7 +608,7 @@
                 <w:color w:val="000000"/>
                 <w:sz w:val="18"/>
               </w:rPr>
-              <w:t>8</w:t>
+              <w:t>9</w:t>
             </w:r>
           </w:p>
         </w:tc>
@@ -677,7 +677,7 @@
                 <w:color w:val="000000"/>
                 <w:sz w:val="18"/>
               </w:rPr>
-              <w:t>9</w:t>
+              <w:t>10</w:t>
             </w:r>
           </w:p>
         </w:tc>
@@ -746,7 +746,7 @@
                 <w:color w:val="000000"/>
                 <w:sz w:val="18"/>
               </w:rPr>
-              <w:t>11</w:t>
+              <w:t>12</w:t>
             </w:r>
           </w:p>
         </w:tc>
@@ -815,7 +815,7 @@
                 <w:color w:val="000000"/>
                 <w:sz w:val="18"/>
               </w:rPr>
-              <w:t>12</w:t>
+              <w:t>13</w:t>
             </w:r>
           </w:p>
         </w:tc>
@@ -884,7 +884,7 @@
                 <w:color w:val="000000"/>
                 <w:sz w:val="18"/>
               </w:rPr>
-              <w:t>13</w:t>
+              <w:t>14</w:t>
             </w:r>
           </w:p>
         </w:tc>
@@ -953,7 +953,7 @@
                 <w:color w:val="000000"/>
                 <w:sz w:val="18"/>
               </w:rPr>
-              <w:t>14</w:t>
+              <w:t>15</w:t>
             </w:r>
           </w:p>
         </w:tc>
@@ -1022,7 +1022,7 @@
                 <w:color w:val="000000"/>
                 <w:sz w:val="18"/>
               </w:rPr>
-              <w:t>15</w:t>
+              <w:t>16</w:t>
             </w:r>
           </w:p>
         </w:tc>
@@ -1091,7 +1091,7 @@
                 <w:color w:val="000000"/>
                 <w:sz w:val="18"/>
               </w:rPr>
-              <w:t>17</w:t>
+              <w:t>18</w:t>
             </w:r>
           </w:p>
         </w:tc>
@@ -1135,7 +1135,73 @@
     </w:p>
     <w:p>
       <w:r>
-        <w:t>Students gather information rather than receive it in a fixed order. Like a consultation team around a table, they decide what to open, divide the reading, and report back to each other. Information can still arrive in more than one release. An initial position gives students something to revisit, and a later release adds to the case file. Most new information is simply more to weigh, such as a new person to hear from or a document nobody had mentioned; occasionally it should prompt students to rethink. Either way, the report keeps the earlier view next to the later one, so changing one’s mind and explaining why one did not can both count as thoughtful work.</w:t>
+        <w:t>Students gather information rather than receive it in a fixed order: like a team around a table, they decide what to open, divide the reading, and report back. A later release can add to the case file. Most new information is simply more to weigh; occasionally it should prompt a rethink. The report keeps earlier and later views side by side, so changing one’s mind and explaining why one didn’t both count as thoughtful work.</w:t>
+      </w:r>
+    </w:p>
+    <w:p>
+      <w:pPr>
+        <w:pStyle w:val="Heading2"/>
+      </w:pPr>
+      <w:r>
+        <w:t>The six-step method</w:t>
+      </w:r>
+    </w:p>
+    <w:p>
+      <w:r>
+        <w:t>Every case follows the method students use to solve cases, so they practise the method rather than learn a new interface each time.</w:t>
+      </w:r>
+    </w:p>
+    <w:p>
+      <w:pPr>
+        <w:pStyle w:val="ListBullet"/>
+      </w:pPr>
+      <w:r>
+        <w:t>Step 1. Identify the moral problem.</w:t>
+      </w:r>
+    </w:p>
+    <w:p>
+      <w:pPr>
+        <w:pStyle w:val="ListBullet"/>
+      </w:pPr>
+      <w:r>
+        <w:t>Step 2. Gather relevant information. This is the case file.</w:t>
+      </w:r>
+    </w:p>
+    <w:p>
+      <w:pPr>
+        <w:pStyle w:val="ListBullet"/>
+      </w:pPr>
+      <w:r>
+        <w:t>Step 3. Identify the available options and their likely consequences.</w:t>
+      </w:r>
+    </w:p>
+    <w:p>
+      <w:pPr>
+        <w:pStyle w:val="ListBullet"/>
+      </w:pPr>
+      <w:r>
+        <w:t>Step 4. Identify and evaluate arguments for and against the available options.</w:t>
+      </w:r>
+    </w:p>
+    <w:p>
+      <w:pPr>
+        <w:pStyle w:val="ListBullet"/>
+      </w:pPr>
+      <w:r>
+        <w:t>Step 5. Choose a course of action and defend it.</w:t>
+      </w:r>
+    </w:p>
+    <w:p>
+      <w:pPr>
+        <w:pStyle w:val="ListBullet"/>
+      </w:pPr>
+      <w:r>
+        <w:t>Step 6. Carry out the chosen action and assess its consequences.</w:t>
+      </w:r>
+    </w:p>
+    <w:p>
+      <w:r>
+        <w:t>Students identify the options themselves; the case doesn’t hand them a list. Step 6 asks for an action plan: who does what first, what could go wrong, and what would show it is working. A follow-up part can show what happened, for students to assess against their plan.</w:t>
       </w:r>
     </w:p>
     <w:p>
@@ -1307,7 +1373,7 @@
                 <w:color w:val="000000"/>
                 <w:sz w:val="19"/>
               </w:rPr>
-              <w:t>A case file students explore freely, a worksheet, and a visible route to a finished report</w:t>
+              <w:t>The six-step method, with the case file as step 2, and a visible route to a finished report</w:t>
             </w:r>
           </w:p>
         </w:tc>
@@ -1580,12 +1646,12 @@
         <w:pStyle w:val="Heading1"/>
       </w:pPr>
       <w:r>
-        <w:t>02 Case file and worksheet structure</w:t>
+        <w:t>02 The six steps in a case</w:t>
       </w:r>
     </w:p>
     <w:p>
       <w:r>
-        <w:t>Each case has two areas. The case file holds everything students can learn about the case, as numbered items they open in any order: records and documents, people involved, plain-language medical background, and policies, codes and law. The worksheet holds the written work, in sections students can answer in any order. Use the following as a reusable authoring model. Cases may change the labels while keeping these functions.</w:t>
+        <w:t>Step 2, gathering relevant information, is the case file: numbered items students open in any order, covering records, people, plain-language medical background, and policies. The other five steps are worksheet sections, answered in any order. The navigation column lists all six, numbered as students learn them.</w:t>
       </w:r>
     </w:p>
     <w:tbl>
@@ -1633,7 +1699,7 @@
                 <w:color w:val="FFFFFF"/>
                 <w:sz w:val="19"/>
               </w:rPr>
-              <w:t>Area</w:t>
+              <w:t>Step</w:t>
             </w:r>
           </w:p>
         </w:tc>
@@ -1734,7 +1800,7 @@
                 <w:color w:val="000000"/>
                 <w:sz w:val="19"/>
               </w:rPr>
-              <w:t>Case file (any time)</w:t>
+              <w:t>1  Identify the moral problem</w:t>
             </w:r>
           </w:p>
         </w:tc>
@@ -1766,6 +1832,107 @@
                 <w:color w:val="000000"/>
                 <w:sz w:val="19"/>
               </w:rPr>
+              <w:t>State the moral problem and a first view.</w:t>
+            </w:r>
+          </w:p>
+        </w:tc>
+        <w:tc>
+          <w:tcPr>
+            <w:tcW w:type="dxa" w:w="3672"/>
+            <w:vAlign w:val="center"/>
+            <w:tcBorders>
+              <w:top w:val="single" w:sz="4" w:color="D9D9D9"/>
+              <w:left w:val="single" w:sz="4" w:color="D9D9D9"/>
+              <w:bottom w:val="single" w:sz="4" w:color="D9D9D9"/>
+              <w:right w:val="single" w:sz="4" w:color="D9D9D9"/>
+            </w:tcBorders>
+            <w:tcMar>
+              <w:top w:w="70" w:type="dxa"/>
+              <w:bottom w:w="70" w:type="dxa"/>
+              <w:left w:w="100" w:type="dxa"/>
+              <w:right w:w="100" w:type="dxa"/>
+            </w:tcMar>
+            <w:shd w:fill="FFFFFF"/>
+          </w:tcPr>
+          <w:p>
+            <w:pPr>
+              <w:spacing w:after="0" w:line="247" w:lineRule="auto"/>
+            </w:pPr>
+            <w:r>
+              <w:rPr>
+                <w:b w:val="0"/>
+                <w:color w:val="000000"/>
+                <w:sz w:val="19"/>
+              </w:rPr>
+              <w:t>Problem statement and initial view</w:t>
+            </w:r>
+          </w:p>
+        </w:tc>
+      </w:tr>
+      <w:tr>
+        <w:trPr>
+          <w:cantSplit/>
+        </w:trPr>
+        <w:tc>
+          <w:tcPr>
+            <w:tcW w:type="dxa" w:w="2189"/>
+            <w:vAlign w:val="center"/>
+            <w:tcBorders>
+              <w:top w:val="single" w:sz="4" w:color="D9D9D9"/>
+              <w:left w:val="single" w:sz="4" w:color="D9D9D9"/>
+              <w:bottom w:val="single" w:sz="4" w:color="D9D9D9"/>
+              <w:right w:val="single" w:sz="4" w:color="D9D9D9"/>
+            </w:tcBorders>
+            <w:tcMar>
+              <w:top w:w="70" w:type="dxa"/>
+              <w:bottom w:w="70" w:type="dxa"/>
+              <w:left w:w="100" w:type="dxa"/>
+              <w:right w:w="100" w:type="dxa"/>
+            </w:tcMar>
+            <w:shd w:fill="F3F5F7"/>
+          </w:tcPr>
+          <w:p>
+            <w:pPr>
+              <w:spacing w:after="0" w:line="247" w:lineRule="auto"/>
+            </w:pPr>
+            <w:r>
+              <w:rPr>
+                <w:b w:val="0"/>
+                <w:color w:val="000000"/>
+                <w:sz w:val="19"/>
+              </w:rPr>
+              <w:t>2  Gather relevant information</w:t>
+            </w:r>
+          </w:p>
+        </w:tc>
+        <w:tc>
+          <w:tcPr>
+            <w:tcW w:type="dxa" w:w="4219"/>
+            <w:vAlign w:val="center"/>
+            <w:tcBorders>
+              <w:top w:val="single" w:sz="4" w:color="D9D9D9"/>
+              <w:left w:val="single" w:sz="4" w:color="D9D9D9"/>
+              <w:bottom w:val="single" w:sz="4" w:color="D9D9D9"/>
+              <w:right w:val="single" w:sz="4" w:color="D9D9D9"/>
+            </w:tcBorders>
+            <w:tcMar>
+              <w:top w:w="70" w:type="dxa"/>
+              <w:bottom w:w="70" w:type="dxa"/>
+              <w:left w:w="100" w:type="dxa"/>
+              <w:right w:w="100" w:type="dxa"/>
+            </w:tcMar>
+            <w:shd w:fill="F3F5F7"/>
+          </w:tcPr>
+          <w:p>
+            <w:pPr>
+              <w:spacing w:after="0" w:line="247" w:lineRule="auto"/>
+            </w:pPr>
+            <w:r>
+              <w:rPr>
+                <w:b w:val="0"/>
+                <w:color w:val="000000"/>
+                <w:sz w:val="19"/>
+              </w:rPr>
               <w:t>Open records, people, medical background, and policies in any order; divide them at a roundtable and report back.</w:t>
             </w:r>
           </w:p>
@@ -1786,7 +1953,7 @@
               <w:left w:w="100" w:type="dxa"/>
               <w:right w:w="100" w:type="dxa"/>
             </w:tcMar>
-            <w:shd w:fill="FFFFFF"/>
+            <w:shd w:fill="F3F5F7"/>
           </w:tcPr>
           <w:p>
             <w:pPr>
@@ -1823,6 +1990,107 @@
               <w:left w:w="100" w:type="dxa"/>
               <w:right w:w="100" w:type="dxa"/>
             </w:tcMar>
+            <w:shd w:fill="FFFFFF"/>
+          </w:tcPr>
+          <w:p>
+            <w:pPr>
+              <w:spacing w:after="0" w:line="247" w:lineRule="auto"/>
+            </w:pPr>
+            <w:r>
+              <w:rPr>
+                <w:b w:val="0"/>
+                <w:color w:val="000000"/>
+                <w:sz w:val="19"/>
+              </w:rPr>
+              <w:t>3  Options and consequences</w:t>
+            </w:r>
+          </w:p>
+        </w:tc>
+        <w:tc>
+          <w:tcPr>
+            <w:tcW w:type="dxa" w:w="4219"/>
+            <w:vAlign w:val="center"/>
+            <w:tcBorders>
+              <w:top w:val="single" w:sz="4" w:color="D9D9D9"/>
+              <w:left w:val="single" w:sz="4" w:color="D9D9D9"/>
+              <w:bottom w:val="single" w:sz="4" w:color="D9D9D9"/>
+              <w:right w:val="single" w:sz="4" w:color="D9D9D9"/>
+            </w:tcBorders>
+            <w:tcMar>
+              <w:top w:w="70" w:type="dxa"/>
+              <w:bottom w:w="70" w:type="dxa"/>
+              <w:left w:w="100" w:type="dxa"/>
+              <w:right w:w="100" w:type="dxa"/>
+            </w:tcMar>
+            <w:shd w:fill="FFFFFF"/>
+          </w:tcPr>
+          <w:p>
+            <w:pPr>
+              <w:spacing w:after="0" w:line="247" w:lineRule="auto"/>
+            </w:pPr>
+            <w:r>
+              <w:rPr>
+                <w:b w:val="0"/>
+                <w:color w:val="000000"/>
+                <w:sz w:val="19"/>
+              </w:rPr>
+              <w:t>List the available options, including unattractive ones, and the likely consequences of each.</w:t>
+            </w:r>
+          </w:p>
+        </w:tc>
+        <w:tc>
+          <w:tcPr>
+            <w:tcW w:type="dxa" w:w="3672"/>
+            <w:vAlign w:val="center"/>
+            <w:tcBorders>
+              <w:top w:val="single" w:sz="4" w:color="D9D9D9"/>
+              <w:left w:val="single" w:sz="4" w:color="D9D9D9"/>
+              <w:bottom w:val="single" w:sz="4" w:color="D9D9D9"/>
+              <w:right w:val="single" w:sz="4" w:color="D9D9D9"/>
+            </w:tcBorders>
+            <w:tcMar>
+              <w:top w:w="70" w:type="dxa"/>
+              <w:bottom w:w="70" w:type="dxa"/>
+              <w:left w:w="100" w:type="dxa"/>
+              <w:right w:w="100" w:type="dxa"/>
+            </w:tcMar>
+            <w:shd w:fill="FFFFFF"/>
+          </w:tcPr>
+          <w:p>
+            <w:pPr>
+              <w:spacing w:after="0" w:line="247" w:lineRule="auto"/>
+            </w:pPr>
+            <w:r>
+              <w:rPr>
+                <w:b w:val="0"/>
+                <w:color w:val="000000"/>
+                <w:sz w:val="19"/>
+              </w:rPr>
+              <w:t>The student’s own list of options</w:t>
+            </w:r>
+          </w:p>
+        </w:tc>
+      </w:tr>
+      <w:tr>
+        <w:trPr>
+          <w:cantSplit/>
+        </w:trPr>
+        <w:tc>
+          <w:tcPr>
+            <w:tcW w:type="dxa" w:w="2189"/>
+            <w:vAlign w:val="center"/>
+            <w:tcBorders>
+              <w:top w:val="single" w:sz="4" w:color="D9D9D9"/>
+              <w:left w:val="single" w:sz="4" w:color="D9D9D9"/>
+              <w:bottom w:val="single" w:sz="4" w:color="D9D9D9"/>
+              <w:right w:val="single" w:sz="4" w:color="D9D9D9"/>
+            </w:tcBorders>
+            <w:tcMar>
+              <w:top w:w="70" w:type="dxa"/>
+              <w:bottom w:w="70" w:type="dxa"/>
+              <w:left w:w="100" w:type="dxa"/>
+              <w:right w:w="100" w:type="dxa"/>
+            </w:tcMar>
             <w:shd w:fill="F3F5F7"/>
           </w:tcPr>
           <w:p>
@@ -1835,7 +2103,7 @@
                 <w:color w:val="000000"/>
                 <w:sz w:val="19"/>
               </w:rPr>
-              <w:t>1  Framing</w:t>
+              <w:t>4  Arguments for and against</w:t>
             </w:r>
           </w:p>
         </w:tc>
@@ -1867,7 +2135,7 @@
                 <w:color w:val="000000"/>
                 <w:sz w:val="19"/>
               </w:rPr>
-              <w:t>State the ethical question and a first view.</w:t>
+              <w:t>Identify and weigh the arguments for and against each listed option.</w:t>
             </w:r>
           </w:p>
         </w:tc>
@@ -1899,7 +2167,7 @@
                 <w:color w:val="000000"/>
                 <w:sz w:val="19"/>
               </w:rPr>
-              <w:t>Issue statement and initial view</w:t>
+              <w:t>Arguments for and against each option</w:t>
             </w:r>
           </w:p>
         </w:tc>
@@ -1936,7 +2204,7 @@
                 <w:color w:val="000000"/>
                 <w:sz w:val="19"/>
               </w:rPr>
-              <w:t>2  Stakeholders and values</w:t>
+              <w:t>5  Choose and defend</w:t>
             </w:r>
           </w:p>
         </w:tc>
@@ -1968,7 +2236,7 @@
                 <w:color w:val="000000"/>
                 <w:sz w:val="19"/>
               </w:rPr>
-              <w:t>Identify whose interests matter and which values are in tension.</w:t>
+              <w:t>Choose one of their own options, defend it, and answer the strongest objection.</w:t>
             </w:r>
           </w:p>
         </w:tc>
@@ -2000,7 +2268,7 @@
                 <w:color w:val="000000"/>
                 <w:sz w:val="19"/>
               </w:rPr>
-              <w:t>Stakeholder concerns and unresolved claims</w:t>
+              <w:t>Choice, defense, objection and reply</w:t>
             </w:r>
           </w:p>
         </w:tc>
@@ -2037,7 +2305,7 @@
                 <w:color w:val="000000"/>
                 <w:sz w:val="19"/>
               </w:rPr>
-              <w:t>3  New information</w:t>
+              <w:t>6  Carry out and assess</w:t>
             </w:r>
           </w:p>
         </w:tc>
@@ -2069,7 +2337,7 @@
                 <w:color w:val="000000"/>
                 <w:sz w:val="19"/>
               </w:rPr>
-              <w:t>Weigh what a later release adds and say whether it changes the recommendation or how to carry it out.</w:t>
+              <w:t>Plan who does what first and what to watch for; in a follow-up part, assess what happened against the plan.</w:t>
             </w:r>
           </w:p>
         </w:tc>
@@ -2101,209 +2369,7 @@
                 <w:color w:val="000000"/>
                 <w:sz w:val="19"/>
               </w:rPr>
-              <w:t>New-information note, with reasons for any change or for no change</w:t>
-            </w:r>
-          </w:p>
-        </w:tc>
-      </w:tr>
-      <w:tr>
-        <w:trPr>
-          <w:cantSplit/>
-        </w:trPr>
-        <w:tc>
-          <w:tcPr>
-            <w:tcW w:type="dxa" w:w="2189"/>
-            <w:vAlign w:val="center"/>
-            <w:tcBorders>
-              <w:top w:val="single" w:sz="4" w:color="D9D9D9"/>
-              <w:left w:val="single" w:sz="4" w:color="D9D9D9"/>
-              <w:bottom w:val="single" w:sz="4" w:color="D9D9D9"/>
-              <w:right w:val="single" w:sz="4" w:color="D9D9D9"/>
-            </w:tcBorders>
-            <w:tcMar>
-              <w:top w:w="70" w:type="dxa"/>
-              <w:bottom w:w="70" w:type="dxa"/>
-              <w:left w:w="100" w:type="dxa"/>
-              <w:right w:w="100" w:type="dxa"/>
-            </w:tcMar>
-            <w:shd w:fill="FFFFFF"/>
-          </w:tcPr>
-          <w:p>
-            <w:pPr>
-              <w:spacing w:after="0" w:line="247" w:lineRule="auto"/>
-            </w:pPr>
-            <w:r>
-              <w:rPr>
-                <w:b w:val="0"/>
-                <w:color w:val="000000"/>
-                <w:sz w:val="19"/>
-              </w:rPr>
-              <w:t>4  Analysis and recommendation</w:t>
-            </w:r>
-          </w:p>
-        </w:tc>
-        <w:tc>
-          <w:tcPr>
-            <w:tcW w:type="dxa" w:w="4219"/>
-            <w:vAlign w:val="center"/>
-            <w:tcBorders>
-              <w:top w:val="single" w:sz="4" w:color="D9D9D9"/>
-              <w:left w:val="single" w:sz="4" w:color="D9D9D9"/>
-              <w:bottom w:val="single" w:sz="4" w:color="D9D9D9"/>
-              <w:right w:val="single" w:sz="4" w:color="D9D9D9"/>
-            </w:tcBorders>
-            <w:tcMar>
-              <w:top w:w="70" w:type="dxa"/>
-              <w:bottom w:w="70" w:type="dxa"/>
-              <w:left w:w="100" w:type="dxa"/>
-              <w:right w:w="100" w:type="dxa"/>
-            </w:tcMar>
-            <w:shd w:fill="FFFFFF"/>
-          </w:tcPr>
-          <w:p>
-            <w:pPr>
-              <w:spacing w:after="0" w:line="247" w:lineRule="auto"/>
-            </w:pPr>
-            <w:r>
-              <w:rPr>
-                <w:b w:val="0"/>
-                <w:color w:val="000000"/>
-                <w:sz w:val="19"/>
-              </w:rPr>
-              <w:t>Compare feasible options, choose and justify one, and answer the strongest objection.</w:t>
-            </w:r>
-          </w:p>
-        </w:tc>
-        <w:tc>
-          <w:tcPr>
-            <w:tcW w:type="dxa" w:w="3672"/>
-            <w:vAlign w:val="center"/>
-            <w:tcBorders>
-              <w:top w:val="single" w:sz="4" w:color="D9D9D9"/>
-              <w:left w:val="single" w:sz="4" w:color="D9D9D9"/>
-              <w:bottom w:val="single" w:sz="4" w:color="D9D9D9"/>
-              <w:right w:val="single" w:sz="4" w:color="D9D9D9"/>
-            </w:tcBorders>
-            <w:tcMar>
-              <w:top w:w="70" w:type="dxa"/>
-              <w:bottom w:w="70" w:type="dxa"/>
-              <w:left w:w="100" w:type="dxa"/>
-              <w:right w:w="100" w:type="dxa"/>
-            </w:tcMar>
-            <w:shd w:fill="FFFFFF"/>
-          </w:tcPr>
-          <w:p>
-            <w:pPr>
-              <w:spacing w:after="0" w:line="247" w:lineRule="auto"/>
-            </w:pPr>
-            <w:r>
-              <w:rPr>
-                <w:b w:val="0"/>
-                <w:color w:val="000000"/>
-                <w:sz w:val="19"/>
-              </w:rPr>
-              <w:t>Recommendation with objection, conditions, and next steps</w:t>
-            </w:r>
-          </w:p>
-        </w:tc>
-      </w:tr>
-      <w:tr>
-        <w:trPr>
-          <w:cantSplit/>
-        </w:trPr>
-        <w:tc>
-          <w:tcPr>
-            <w:tcW w:type="dxa" w:w="2189"/>
-            <w:vAlign w:val="center"/>
-            <w:tcBorders>
-              <w:top w:val="single" w:sz="4" w:color="D9D9D9"/>
-              <w:left w:val="single" w:sz="4" w:color="D9D9D9"/>
-              <w:bottom w:val="single" w:sz="4" w:color="D9D9D9"/>
-              <w:right w:val="single" w:sz="4" w:color="D9D9D9"/>
-            </w:tcBorders>
-            <w:tcMar>
-              <w:top w:w="70" w:type="dxa"/>
-              <w:bottom w:w="70" w:type="dxa"/>
-              <w:left w:w="100" w:type="dxa"/>
-              <w:right w:w="100" w:type="dxa"/>
-            </w:tcMar>
-            <w:shd w:fill="F3F5F7"/>
-          </w:tcPr>
-          <w:p>
-            <w:pPr>
-              <w:spacing w:after="0" w:line="247" w:lineRule="auto"/>
-            </w:pPr>
-            <w:r>
-              <w:rPr>
-                <w:b w:val="0"/>
-                <w:color w:val="000000"/>
-                <w:sz w:val="19"/>
-              </w:rPr>
-              <w:t>5  Reflection</w:t>
-            </w:r>
-          </w:p>
-        </w:tc>
-        <w:tc>
-          <w:tcPr>
-            <w:tcW w:type="dxa" w:w="4219"/>
-            <w:vAlign w:val="center"/>
-            <w:tcBorders>
-              <w:top w:val="single" w:sz="4" w:color="D9D9D9"/>
-              <w:left w:val="single" w:sz="4" w:color="D9D9D9"/>
-              <w:bottom w:val="single" w:sz="4" w:color="D9D9D9"/>
-              <w:right w:val="single" w:sz="4" w:color="D9D9D9"/>
-            </w:tcBorders>
-            <w:tcMar>
-              <w:top w:w="70" w:type="dxa"/>
-              <w:bottom w:w="70" w:type="dxa"/>
-              <w:left w:w="100" w:type="dxa"/>
-              <w:right w:w="100" w:type="dxa"/>
-            </w:tcMar>
-            <w:shd w:fill="F3F5F7"/>
-          </w:tcPr>
-          <w:p>
-            <w:pPr>
-              <w:spacing w:after="0" w:line="247" w:lineRule="auto"/>
-            </w:pPr>
-            <w:r>
-              <w:rPr>
-                <w:b w:val="0"/>
-                <w:color w:val="000000"/>
-                <w:sz w:val="19"/>
-              </w:rPr>
-              <w:t>Review how the view developed and what remains uncertain.</w:t>
-            </w:r>
-          </w:p>
-        </w:tc>
-        <w:tc>
-          <w:tcPr>
-            <w:tcW w:type="dxa" w:w="3672"/>
-            <w:vAlign w:val="center"/>
-            <w:tcBorders>
-              <w:top w:val="single" w:sz="4" w:color="D9D9D9"/>
-              <w:left w:val="single" w:sz="4" w:color="D9D9D9"/>
-              <w:bottom w:val="single" w:sz="4" w:color="D9D9D9"/>
-              <w:right w:val="single" w:sz="4" w:color="D9D9D9"/>
-            </w:tcBorders>
-            <w:tcMar>
-              <w:top w:w="70" w:type="dxa"/>
-              <w:bottom w:w="70" w:type="dxa"/>
-              <w:left w:w="100" w:type="dxa"/>
-              <w:right w:w="100" w:type="dxa"/>
-            </w:tcMar>
-            <w:shd w:fill="F3F5F7"/>
-          </w:tcPr>
-          <w:p>
-            <w:pPr>
-              <w:spacing w:after="0" w:line="247" w:lineRule="auto"/>
-            </w:pPr>
-            <w:r>
-              <w:rPr>
-                <w:b w:val="0"/>
-                <w:color w:val="000000"/>
-                <w:sz w:val="19"/>
-              </w:rPr>
-              <w:t>Final consultation report and reflection</w:t>
+              <w:t>Action plan and, if used, the assessment</w:t>
             </w:r>
           </w:p>
         </w:tc>
@@ -2342,7 +2408,7 @@
     </w:p>
     <w:p>
       <w:r>
-        <w:t>Decide which items students need to form an initial view and which can arrive in a later release. Most later items should simply add to what students must consider: a new stakeholder, a document, a constraint of time or resources. Some can be designed to put pressure on an earlier inference, such as whose account is credible or which option is feasible. Vary this across cases so that students don’t learn to expect a twist. Arbitrary surprises encourage guessing rather than careful inquiry.</w:t>
+        <w:t>Decide which items students need to form an initial view and which can arrive in a later release. Most later items should simply add to what students weigh: a new stakeholder, a document, a constraint. Some can put pressure on an earlier inference. Vary this across cases so students don’t learn to expect a twist. Ask about new information at the start of the next step students work on, and say that it’s fine if it changes nothing. Keep each student’s option list, arguments, and choice in one part: split a case before step 3 or after step 5.</w:t>
       </w:r>
     </w:p>
     <w:p>
@@ -4767,7 +4833,7 @@
     </w:p>
     <w:p>
       <w:r>
-        <w:t>List every case-file item, its kind, and the release it belongs to. Include a medical background item for each condition or treatment students must understand. Draft the prompt and saved answer for every worksheet section. Write the initial position prompt for the first release and a new-information prompt for any later one. Make sure students can find what they need before making the final recommendation.</w:t>
+        <w:t>Plan the case around the six steps. List every case-file item, its kind, and the release it belongs to, with a medical background item for each condition or treatment students must understand. Check that the case file lets students find several feasible options on their own, and write your own option set for comparison after they choose. Draft the prompt and saved answer for steps 1, 5, and 6, and decide whether step 6 will have a follow-up part.</w:t>
       </w:r>
     </w:p>
     <w:p>
@@ -5579,7 +5645,7 @@
     </w:p>
     <w:p>
       <w:r>
-        <w:t>Offer alternatives that are understandable, feasible within the fictional case, and distinguishable in their consequences or process. Avoid a polished “good” option beside obviously careless distractors. When a custom recommendation is allowed, require the student to explain its practical steps and relationship to the listed options.</w:t>
+        <w:t>Students identify the options themselves in step 3, so build the case so that several feasible options can be found in the case file, including some that are uncomfortable or easily overlooked. Write your own option set as well. The engine shows it only after students choose, as “Options others have considered,” so it can’t anchor their list; the debrief can compare the two. In your own set, avoid a polished “good” option beside obviously careless distractors.</w:t>
       </w:r>
     </w:p>
     <w:p>
@@ -5721,7 +5787,7 @@
                 <w:color w:val="000000"/>
                 <w:sz w:val="19"/>
               </w:rPr>
-              <w:t>Consultation context</w:t>
+              <w:t>Problem and context</w:t>
             </w:r>
           </w:p>
         </w:tc>
@@ -5753,7 +5819,7 @@
                 <w:color w:val="000000"/>
                 <w:sz w:val="19"/>
               </w:rPr>
-              <w:t>Case title and version, team label if used, ethical question</w:t>
+              <w:t>Case title and version, team, the moral problem, and the initial view</w:t>
             </w:r>
           </w:p>
         </w:tc>
@@ -5790,7 +5856,7 @@
                 <w:color w:val="000000"/>
                 <w:sz w:val="19"/>
               </w:rPr>
-              <w:t>Initial view</w:t>
+              <w:t>Information</w:t>
             </w:r>
           </w:p>
         </w:tc>
@@ -5822,7 +5888,7 @@
                 <w:color w:val="000000"/>
                 <w:sz w:val="19"/>
               </w:rPr>
-              <w:t>Provisional position and the reasons available at intake</w:t>
+              <w:t>Notes on case-file items, stakeholder concerns, and the response to new information</w:t>
             </w:r>
           </w:p>
         </w:tc>
@@ -5859,7 +5925,7 @@
                 <w:color w:val="000000"/>
                 <w:sz w:val="19"/>
               </w:rPr>
-              <w:t>Stakeholder analysis</w:t>
+              <w:t>Options and consequences</w:t>
             </w:r>
           </w:p>
         </w:tc>
@@ -5891,7 +5957,7 @@
                 <w:color w:val="000000"/>
                 <w:sz w:val="19"/>
               </w:rPr>
-              <w:t>Relevant concerns, competing values, and unresolved claims</w:t>
+              <w:t>Each option the student listed, with its likely consequences</w:t>
             </w:r>
           </w:p>
         </w:tc>
@@ -5928,7 +5994,7 @@
                 <w:color w:val="000000"/>
                 <w:sz w:val="19"/>
               </w:rPr>
-              <w:t>New information</w:t>
+              <w:t>Arguments</w:t>
             </w:r>
           </w:p>
         </w:tc>
@@ -5960,7 +6026,7 @@
                 <w:color w:val="000000"/>
                 <w:sz w:val="19"/>
               </w:rPr>
-              <w:t>What the new items add, how they were weighed, and whether the view changed</w:t>
+              <w:t>Arguments for and against each option</w:t>
             </w:r>
           </w:p>
         </w:tc>
@@ -5997,7 +6063,7 @@
                 <w:color w:val="000000"/>
                 <w:sz w:val="19"/>
               </w:rPr>
-              <w:t>Options and recommendation</w:t>
+              <w:t>Choice and defense</w:t>
             </w:r>
           </w:p>
         </w:tc>
@@ -6029,7 +6095,7 @@
                 <w:color w:val="000000"/>
                 <w:sz w:val="19"/>
               </w:rPr>
-              <w:t>Alternatives considered, justification, objection, response</w:t>
+              <w:t>Chosen option, defense, objection, and reply</w:t>
             </w:r>
           </w:p>
         </w:tc>
@@ -6066,7 +6132,7 @@
                 <w:color w:val="000000"/>
                 <w:sz w:val="19"/>
               </w:rPr>
-              <w:t>Conditions and reflection</w:t>
+              <w:t>Action and assessment</w:t>
             </w:r>
           </w:p>
         </w:tc>
@@ -6098,7 +6164,7 @@
                 <w:color w:val="000000"/>
                 <w:sz w:val="19"/>
               </w:rPr>
-              <w:t>Next steps, limits, further questions, and learning reflection</w:t>
+              <w:t>Action plan, what to watch for, and any follow-up assessment</w:t>
             </w:r>
           </w:p>
         </w:tc>
@@ -6432,7 +6498,7 @@
                 <w:color w:val="000000"/>
                 <w:sz w:val="19"/>
               </w:rPr>
-              <w:t>Case file roundtable and initial view</w:t>
+              <w:t>Steps 1–2: the problem and a case-file roundtable</w:t>
             </w:r>
           </w:p>
         </w:tc>
@@ -6501,7 +6567,7 @@
                 <w:color w:val="000000"/>
                 <w:sz w:val="19"/>
               </w:rPr>
-              <w:t>25–35 min</w:t>
+              <w:t>25–45 min</w:t>
             </w:r>
           </w:p>
         </w:tc>
@@ -6533,7 +6599,7 @@
                 <w:color w:val="000000"/>
                 <w:sz w:val="19"/>
               </w:rPr>
-              <w:t>New information (Part 2 code)</w:t>
+              <w:t>Steps 3–4: options, consequences, and arguments</w:t>
             </w:r>
           </w:p>
         </w:tc>
@@ -6565,7 +6631,7 @@
                 <w:color w:val="000000"/>
                 <w:sz w:val="19"/>
               </w:rPr>
-              <w:t>After a brief discussion of provisional views, release the next code. Ask what the new items add and whether it matters.</w:t>
+              <w:t>Ask for an option nobody likes, and for the best argument against the favorite.</w:t>
             </w:r>
           </w:p>
         </w:tc>
@@ -6602,7 +6668,7 @@
                 <w:color w:val="000000"/>
                 <w:sz w:val="19"/>
               </w:rPr>
-              <w:t>35–50 min</w:t>
+              <w:t>45–55 min</w:t>
             </w:r>
           </w:p>
         </w:tc>
@@ -6634,7 +6700,7 @@
                 <w:color w:val="000000"/>
                 <w:sz w:val="19"/>
               </w:rPr>
-              <w:t>Analysis and recommendation</w:t>
+              <w:t>Step 5: choose and defend</w:t>
             </w:r>
           </w:p>
         </w:tc>
@@ -6666,7 +6732,7 @@
                 <w:color w:val="000000"/>
                 <w:sz w:val="19"/>
               </w:rPr>
-              <w:t>Press for alternatives, objections, and practical conditions.</w:t>
+              <w:t>Press for objections and practical conditions.</w:t>
             </w:r>
           </w:p>
         </w:tc>
@@ -6703,7 +6769,7 @@
                 <w:color w:val="000000"/>
                 <w:sz w:val="19"/>
               </w:rPr>
-              <w:t>50–60 min</w:t>
+              <w:t>55–65 min</w:t>
             </w:r>
           </w:p>
         </w:tc>
@@ -6735,7 +6801,7 @@
                 <w:color w:val="000000"/>
                 <w:sz w:val="19"/>
               </w:rPr>
-              <w:t>Report review and download</w:t>
+              <w:t>Step 6: action plan and report</w:t>
             </w:r>
           </w:p>
         </w:tc>
@@ -6767,7 +6833,7 @@
                 <w:color w:val="000000"/>
                 <w:sz w:val="19"/>
               </w:rPr>
-              <w:t>Verify that every team can retain and submit its work.</w:t>
+              <w:t>Check that plans say who does what first, and that every team can save its work.</w:t>
             </w:r>
           </w:p>
         </w:tc>
@@ -6804,7 +6870,7 @@
                 <w:color w:val="000000"/>
                 <w:sz w:val="19"/>
               </w:rPr>
-              <w:t>60–75 min</w:t>
+              <w:t>65–75 min</w:t>
             </w:r>
           </w:p>
         </w:tc>
@@ -6868,7 +6934,7 @@
                 <w:color w:val="000000"/>
                 <w:sz w:val="19"/>
               </w:rPr>
-              <w:t>Compare arguments and examine changes in judgment.</w:t>
+              <w:t>Compare option lists and arguments, then examine changes in judgment.</w:t>
             </w:r>
           </w:p>
         </w:tc>
@@ -6955,7 +7021,7 @@
     </w:p>
     <w:p>
       <w:r>
-        <w:t>For a shorter class, assign the first case-file reading beforehand and reserve class time for discussion and the worksheet. For asynchronous work, require an individual initial response before group discussion. Confirm that every student can access the file and retain their report. Keep a readable case transcript and response worksheet available as an alternative if the interactive file cannot run.</w:t>
+        <w:t>For a shorter class, assign the first case-file reading beforehand and reserve class time for discussion and the worksheet. For asynchronous work, require an individual initial response before group discussion. Confirm that every student can access the file and retain their report. Keep a readable case transcript and response worksheet available as an alternative if the interactive file cannot run. To release new information to the whole class, split the case before step 3 or after step 5 and announce the next code. A follow-up part for step 6 can open in the next class.</w:t>
       </w:r>
     </w:p>
     <w:p>
@@ -7130,7 +7196,7 @@
                 <w:color w:val="000000"/>
                 <w:sz w:val="19"/>
               </w:rPr>
-              <w:t>Ethical framing</w:t>
+              <w:t>1  Identifying the moral problem</w:t>
             </w:r>
           </w:p>
         </w:tc>
@@ -7194,7 +7260,7 @@
                 <w:color w:val="000000"/>
                 <w:sz w:val="19"/>
               </w:rPr>
-              <w:t>States a focused ethical question and separates it from factual or procedural questions.</w:t>
+              <w:t>States a focused moral problem and separates it from factual or procedural questions.</w:t>
             </w:r>
           </w:p>
         </w:tc>
@@ -7231,7 +7297,209 @@
                 <w:color w:val="000000"/>
                 <w:sz w:val="19"/>
               </w:rPr>
-              <w:t>Stakeholder analysis</w:t>
+              <w:t>2  Gathering relevant information</w:t>
+            </w:r>
+          </w:p>
+        </w:tc>
+        <w:tc>
+          <w:tcPr>
+            <w:tcW w:type="dxa" w:w="792"/>
+            <w:vAlign w:val="center"/>
+            <w:tcBorders>
+              <w:top w:val="single" w:sz="4" w:color="D9D9D9"/>
+              <w:left w:val="single" w:sz="4" w:color="D9D9D9"/>
+              <w:bottom w:val="single" w:sz="4" w:color="D9D9D9"/>
+              <w:right w:val="single" w:sz="4" w:color="D9D9D9"/>
+            </w:tcBorders>
+            <w:tcMar>
+              <w:top w:w="70" w:type="dxa"/>
+              <w:bottom w:w="70" w:type="dxa"/>
+              <w:left w:w="100" w:type="dxa"/>
+              <w:right w:w="100" w:type="dxa"/>
+            </w:tcMar>
+            <w:shd w:fill="F3F5F7"/>
+          </w:tcPr>
+          <w:p>
+            <w:pPr>
+              <w:spacing w:after="0" w:line="247" w:lineRule="auto"/>
+            </w:pPr>
+            <w:r>
+              <w:rPr>
+                <w:b w:val="0"/>
+                <w:color w:val="000000"/>
+                <w:sz w:val="19"/>
+              </w:rPr>
+              <w:t>15</w:t>
+            </w:r>
+          </w:p>
+        </w:tc>
+        <w:tc>
+          <w:tcPr>
+            <w:tcW w:type="dxa" w:w="7056"/>
+            <w:vAlign w:val="center"/>
+            <w:tcBorders>
+              <w:top w:val="single" w:sz="4" w:color="D9D9D9"/>
+              <w:left w:val="single" w:sz="4" w:color="D9D9D9"/>
+              <w:bottom w:val="single" w:sz="4" w:color="D9D9D9"/>
+              <w:right w:val="single" w:sz="4" w:color="D9D9D9"/>
+            </w:tcBorders>
+            <w:tcMar>
+              <w:top w:w="70" w:type="dxa"/>
+              <w:bottom w:w="70" w:type="dxa"/>
+              <w:left w:w="100" w:type="dxa"/>
+              <w:right w:w="100" w:type="dxa"/>
+            </w:tcMar>
+            <w:shd w:fill="F3F5F7"/>
+          </w:tcPr>
+          <w:p>
+            <w:pPr>
+              <w:spacing w:after="0" w:line="247" w:lineRule="auto"/>
+            </w:pPr>
+            <w:r>
+              <w:rPr>
+                <w:b w:val="0"/>
+                <w:color w:val="000000"/>
+                <w:sz w:val="19"/>
+              </w:rPr>
+              <w:t>Uses the case file accurately, represents stakeholders fairly, separates facts from assumptions, and weighs new information.</w:t>
+            </w:r>
+          </w:p>
+        </w:tc>
+      </w:tr>
+      <w:tr>
+        <w:trPr>
+          <w:cantSplit/>
+        </w:trPr>
+        <w:tc>
+          <w:tcPr>
+            <w:tcW w:type="dxa" w:w="2232"/>
+            <w:vAlign w:val="center"/>
+            <w:tcBorders>
+              <w:top w:val="single" w:sz="4" w:color="D9D9D9"/>
+              <w:left w:val="single" w:sz="4" w:color="D9D9D9"/>
+              <w:bottom w:val="single" w:sz="4" w:color="D9D9D9"/>
+              <w:right w:val="single" w:sz="4" w:color="D9D9D9"/>
+            </w:tcBorders>
+            <w:tcMar>
+              <w:top w:w="70" w:type="dxa"/>
+              <w:bottom w:w="70" w:type="dxa"/>
+              <w:left w:w="100" w:type="dxa"/>
+              <w:right w:w="100" w:type="dxa"/>
+            </w:tcMar>
+            <w:shd w:fill="FFFFFF"/>
+          </w:tcPr>
+          <w:p>
+            <w:pPr>
+              <w:spacing w:after="0" w:line="247" w:lineRule="auto"/>
+            </w:pPr>
+            <w:r>
+              <w:rPr>
+                <w:b w:val="0"/>
+                <w:color w:val="000000"/>
+                <w:sz w:val="19"/>
+              </w:rPr>
+              <w:t>3  Options and consequences</w:t>
+            </w:r>
+          </w:p>
+        </w:tc>
+        <w:tc>
+          <w:tcPr>
+            <w:tcW w:type="dxa" w:w="792"/>
+            <w:vAlign w:val="center"/>
+            <w:tcBorders>
+              <w:top w:val="single" w:sz="4" w:color="D9D9D9"/>
+              <w:left w:val="single" w:sz="4" w:color="D9D9D9"/>
+              <w:bottom w:val="single" w:sz="4" w:color="D9D9D9"/>
+              <w:right w:val="single" w:sz="4" w:color="D9D9D9"/>
+            </w:tcBorders>
+            <w:tcMar>
+              <w:top w:w="70" w:type="dxa"/>
+              <w:bottom w:w="70" w:type="dxa"/>
+              <w:left w:w="100" w:type="dxa"/>
+              <w:right w:w="100" w:type="dxa"/>
+            </w:tcMar>
+            <w:shd w:fill="FFFFFF"/>
+          </w:tcPr>
+          <w:p>
+            <w:pPr>
+              <w:spacing w:after="0" w:line="247" w:lineRule="auto"/>
+            </w:pPr>
+            <w:r>
+              <w:rPr>
+                <w:b w:val="0"/>
+                <w:color w:val="000000"/>
+                <w:sz w:val="19"/>
+              </w:rPr>
+              <w:t>15</w:t>
+            </w:r>
+          </w:p>
+        </w:tc>
+        <w:tc>
+          <w:tcPr>
+            <w:tcW w:type="dxa" w:w="7056"/>
+            <w:vAlign w:val="center"/>
+            <w:tcBorders>
+              <w:top w:val="single" w:sz="4" w:color="D9D9D9"/>
+              <w:left w:val="single" w:sz="4" w:color="D9D9D9"/>
+              <w:bottom w:val="single" w:sz="4" w:color="D9D9D9"/>
+              <w:right w:val="single" w:sz="4" w:color="D9D9D9"/>
+            </w:tcBorders>
+            <w:tcMar>
+              <w:top w:w="70" w:type="dxa"/>
+              <w:bottom w:w="70" w:type="dxa"/>
+              <w:left w:w="100" w:type="dxa"/>
+              <w:right w:w="100" w:type="dxa"/>
+            </w:tcMar>
+            <w:shd w:fill="FFFFFF"/>
+          </w:tcPr>
+          <w:p>
+            <w:pPr>
+              <w:spacing w:after="0" w:line="247" w:lineRule="auto"/>
+            </w:pPr>
+            <w:r>
+              <w:rPr>
+                <w:b w:val="0"/>
+                <w:color w:val="000000"/>
+                <w:sz w:val="19"/>
+              </w:rPr>
+              <w:t>Identifies the feasible options, including less obvious ones, and their likely consequences.</w:t>
+            </w:r>
+          </w:p>
+        </w:tc>
+      </w:tr>
+      <w:tr>
+        <w:trPr>
+          <w:cantSplit/>
+        </w:trPr>
+        <w:tc>
+          <w:tcPr>
+            <w:tcW w:type="dxa" w:w="2232"/>
+            <w:vAlign w:val="center"/>
+            <w:tcBorders>
+              <w:top w:val="single" w:sz="4" w:color="D9D9D9"/>
+              <w:left w:val="single" w:sz="4" w:color="D9D9D9"/>
+              <w:bottom w:val="single" w:sz="4" w:color="D9D9D9"/>
+              <w:right w:val="single" w:sz="4" w:color="D9D9D9"/>
+            </w:tcBorders>
+            <w:tcMar>
+              <w:top w:w="70" w:type="dxa"/>
+              <w:bottom w:w="70" w:type="dxa"/>
+              <w:left w:w="100" w:type="dxa"/>
+              <w:right w:w="100" w:type="dxa"/>
+            </w:tcMar>
+            <w:shd w:fill="F3F5F7"/>
+          </w:tcPr>
+          <w:p>
+            <w:pPr>
+              <w:spacing w:after="0" w:line="247" w:lineRule="auto"/>
+            </w:pPr>
+            <w:r>
+              <w:rPr>
+                <w:b w:val="0"/>
+                <w:color w:val="000000"/>
+                <w:sz w:val="19"/>
+              </w:rPr>
+              <w:t>4  Arguments for and against</w:t>
             </w:r>
           </w:p>
         </w:tc>
@@ -7295,7 +7563,7 @@
                 <w:color w:val="000000"/>
                 <w:sz w:val="19"/>
               </w:rPr>
-              <w:t>Represents relevant perspectives accurately and explains the values and tensions involved.</w:t>
+              <w:t>Applies ethical concepts to the facts and evaluates the strongest arguments on each side.</w:t>
             </w:r>
           </w:p>
         </w:tc>
@@ -7332,209 +7600,7 @@
                 <w:color w:val="000000"/>
                 <w:sz w:val="19"/>
               </w:rPr>
-              <w:t>Integrating new information</w:t>
-            </w:r>
-          </w:p>
-        </w:tc>
-        <w:tc>
-          <w:tcPr>
-            <w:tcW w:type="dxa" w:w="792"/>
-            <w:vAlign w:val="center"/>
-            <w:tcBorders>
-              <w:top w:val="single" w:sz="4" w:color="D9D9D9"/>
-              <w:left w:val="single" w:sz="4" w:color="D9D9D9"/>
-              <w:bottom w:val="single" w:sz="4" w:color="D9D9D9"/>
-              <w:right w:val="single" w:sz="4" w:color="D9D9D9"/>
-            </w:tcBorders>
-            <w:tcMar>
-              <w:top w:w="70" w:type="dxa"/>
-              <w:bottom w:w="70" w:type="dxa"/>
-              <w:left w:w="100" w:type="dxa"/>
-              <w:right w:w="100" w:type="dxa"/>
-            </w:tcMar>
-            <w:shd w:fill="FFFFFF"/>
-          </w:tcPr>
-          <w:p>
-            <w:pPr>
-              <w:spacing w:after="0" w:line="247" w:lineRule="auto"/>
-            </w:pPr>
-            <w:r>
-              <w:rPr>
-                <w:b w:val="0"/>
-                <w:color w:val="000000"/>
-                <w:sz w:val="19"/>
-              </w:rPr>
-              <w:t>15</w:t>
-            </w:r>
-          </w:p>
-        </w:tc>
-        <w:tc>
-          <w:tcPr>
-            <w:tcW w:type="dxa" w:w="7056"/>
-            <w:vAlign w:val="center"/>
-            <w:tcBorders>
-              <w:top w:val="single" w:sz="4" w:color="D9D9D9"/>
-              <w:left w:val="single" w:sz="4" w:color="D9D9D9"/>
-              <w:bottom w:val="single" w:sz="4" w:color="D9D9D9"/>
-              <w:right w:val="single" w:sz="4" w:color="D9D9D9"/>
-            </w:tcBorders>
-            <w:tcMar>
-              <w:top w:w="70" w:type="dxa"/>
-              <w:bottom w:w="70" w:type="dxa"/>
-              <w:left w:w="100" w:type="dxa"/>
-              <w:right w:w="100" w:type="dxa"/>
-            </w:tcMar>
-            <w:shd w:fill="FFFFFF"/>
-          </w:tcPr>
-          <w:p>
-            <w:pPr>
-              <w:spacing w:after="0" w:line="247" w:lineRule="auto"/>
-            </w:pPr>
-            <w:r>
-              <w:rPr>
-                <w:b w:val="0"/>
-                <w:color w:val="000000"/>
-                <w:sz w:val="19"/>
-              </w:rPr>
-              <w:t>Uses case evidence carefully, identifies assumptions, and explains whether and how new information affects the recommendation.</w:t>
-            </w:r>
-          </w:p>
-        </w:tc>
-      </w:tr>
-      <w:tr>
-        <w:trPr>
-          <w:cantSplit/>
-        </w:trPr>
-        <w:tc>
-          <w:tcPr>
-            <w:tcW w:type="dxa" w:w="2232"/>
-            <w:vAlign w:val="center"/>
-            <w:tcBorders>
-              <w:top w:val="single" w:sz="4" w:color="D9D9D9"/>
-              <w:left w:val="single" w:sz="4" w:color="D9D9D9"/>
-              <w:bottom w:val="single" w:sz="4" w:color="D9D9D9"/>
-              <w:right w:val="single" w:sz="4" w:color="D9D9D9"/>
-            </w:tcBorders>
-            <w:tcMar>
-              <w:top w:w="70" w:type="dxa"/>
-              <w:bottom w:w="70" w:type="dxa"/>
-              <w:left w:w="100" w:type="dxa"/>
-              <w:right w:w="100" w:type="dxa"/>
-            </w:tcMar>
-            <w:shd w:fill="F3F5F7"/>
-          </w:tcPr>
-          <w:p>
-            <w:pPr>
-              <w:spacing w:after="0" w:line="247" w:lineRule="auto"/>
-            </w:pPr>
-            <w:r>
-              <w:rPr>
-                <w:b w:val="0"/>
-                <w:color w:val="000000"/>
-                <w:sz w:val="19"/>
-              </w:rPr>
-              <w:t>Ethical reasoning</w:t>
-            </w:r>
-          </w:p>
-        </w:tc>
-        <w:tc>
-          <w:tcPr>
-            <w:tcW w:type="dxa" w:w="792"/>
-            <w:vAlign w:val="center"/>
-            <w:tcBorders>
-              <w:top w:val="single" w:sz="4" w:color="D9D9D9"/>
-              <w:left w:val="single" w:sz="4" w:color="D9D9D9"/>
-              <w:bottom w:val="single" w:sz="4" w:color="D9D9D9"/>
-              <w:right w:val="single" w:sz="4" w:color="D9D9D9"/>
-            </w:tcBorders>
-            <w:tcMar>
-              <w:top w:w="70" w:type="dxa"/>
-              <w:bottom w:w="70" w:type="dxa"/>
-              <w:left w:w="100" w:type="dxa"/>
-              <w:right w:w="100" w:type="dxa"/>
-            </w:tcMar>
-            <w:shd w:fill="F3F5F7"/>
-          </w:tcPr>
-          <w:p>
-            <w:pPr>
-              <w:spacing w:after="0" w:line="247" w:lineRule="auto"/>
-            </w:pPr>
-            <w:r>
-              <w:rPr>
-                <w:b w:val="0"/>
-                <w:color w:val="000000"/>
-                <w:sz w:val="19"/>
-              </w:rPr>
-              <w:t>20</w:t>
-            </w:r>
-          </w:p>
-        </w:tc>
-        <w:tc>
-          <w:tcPr>
-            <w:tcW w:type="dxa" w:w="7056"/>
-            <w:vAlign w:val="center"/>
-            <w:tcBorders>
-              <w:top w:val="single" w:sz="4" w:color="D9D9D9"/>
-              <w:left w:val="single" w:sz="4" w:color="D9D9D9"/>
-              <w:bottom w:val="single" w:sz="4" w:color="D9D9D9"/>
-              <w:right w:val="single" w:sz="4" w:color="D9D9D9"/>
-            </w:tcBorders>
-            <w:tcMar>
-              <w:top w:w="70" w:type="dxa"/>
-              <w:bottom w:w="70" w:type="dxa"/>
-              <w:left w:w="100" w:type="dxa"/>
-              <w:right w:w="100" w:type="dxa"/>
-            </w:tcMar>
-            <w:shd w:fill="F3F5F7"/>
-          </w:tcPr>
-          <w:p>
-            <w:pPr>
-              <w:spacing w:after="0" w:line="247" w:lineRule="auto"/>
-            </w:pPr>
-            <w:r>
-              <w:rPr>
-                <w:b w:val="0"/>
-                <w:color w:val="000000"/>
-                <w:sz w:val="19"/>
-              </w:rPr>
-              <w:t>Applies relevant concepts to particular facts and compares feasible alternatives.</w:t>
-            </w:r>
-          </w:p>
-        </w:tc>
-      </w:tr>
-      <w:tr>
-        <w:trPr>
-          <w:cantSplit/>
-        </w:trPr>
-        <w:tc>
-          <w:tcPr>
-            <w:tcW w:type="dxa" w:w="2232"/>
-            <w:vAlign w:val="center"/>
-            <w:tcBorders>
-              <w:top w:val="single" w:sz="4" w:color="D9D9D9"/>
-              <w:left w:val="single" w:sz="4" w:color="D9D9D9"/>
-              <w:bottom w:val="single" w:sz="4" w:color="D9D9D9"/>
-              <w:right w:val="single" w:sz="4" w:color="D9D9D9"/>
-            </w:tcBorders>
-            <w:tcMar>
-              <w:top w:w="70" w:type="dxa"/>
-              <w:bottom w:w="70" w:type="dxa"/>
-              <w:left w:w="100" w:type="dxa"/>
-              <w:right w:w="100" w:type="dxa"/>
-            </w:tcMar>
-            <w:shd w:fill="FFFFFF"/>
-          </w:tcPr>
-          <w:p>
-            <w:pPr>
-              <w:spacing w:after="0" w:line="247" w:lineRule="auto"/>
-            </w:pPr>
-            <w:r>
-              <w:rPr>
-                <w:b w:val="0"/>
-                <w:color w:val="000000"/>
-                <w:sz w:val="19"/>
-              </w:rPr>
-              <w:t>Recommendation and objection</w:t>
+              <w:t>5  Choice and defense</w:t>
             </w:r>
           </w:p>
         </w:tc>
@@ -7598,7 +7664,7 @@
                 <w:color w:val="000000"/>
                 <w:sz w:val="19"/>
               </w:rPr>
-              <w:t>Justifies an actionable recommendation, addresses a serious objection, and states conditions.</w:t>
+              <w:t>Chooses an actionable course, defends it, and answers a serious objection.</w:t>
             </w:r>
           </w:p>
         </w:tc>
@@ -7635,7 +7701,7 @@
                 <w:color w:val="000000"/>
                 <w:sz w:val="19"/>
               </w:rPr>
-              <w:t>Reflection and communication</w:t>
+              <w:t>6  Action and assessment</w:t>
             </w:r>
           </w:p>
         </w:tc>
@@ -7667,7 +7733,7 @@
                 <w:color w:val="000000"/>
                 <w:sz w:val="19"/>
               </w:rPr>
-              <w:t>10</w:t>
+              <w:t>15</w:t>
             </w:r>
           </w:p>
         </w:tc>
@@ -7699,7 +7765,7 @@
                 <w:color w:val="000000"/>
                 <w:sz w:val="19"/>
               </w:rPr>
-              <w:t>Identifies uncertainty and learning clearly in an organized, readable report.</w:t>
+              <w:t>Gives a realistic plan, says what would show it is working, and in a follow-up assesses the consequences honestly.</w:t>
             </w:r>
           </w:p>
         </w:tc>
@@ -7822,7 +7888,7 @@
     </w:p>
     <w:p>
       <w:r>
-        <w:t>Preserve the two areas: a case file of numbered items (records and documents, people involved, plain-language medical background, and policies, codes and law) that students open in any order, and a worksheet of written sections they answer in any order. Use the approved section labels. Provide a visible Open the case file button on the opening screen, a navigation column showing each section’s status, clear instructions, and a named next action on every page.</w:t>
+        <w:t>Organize the case around the six-step method: identify the moral problem; gather relevant information; identify the options and their likely consequences; evaluate arguments for and against; choose a course of action and defend it; carry it out and assess its consequences. Step 2 is a case file of numbered items (records and documents, people involved, plain-language medical background, and policies, codes and law) that students open in any order. The other steps are worksheet sections students answer in any order. Students list their own options, add arguments for each, and choose from their own list. Provide a visible Open the case file button on the opening screen, a navigation column listing the six steps with their status, clear instructions, and a named next action on every page.</w:t>
       </w:r>
     </w:p>
     <w:p>
@@ -7878,7 +7944,7 @@
     </w:p>
     <w:p>
       <w:r>
-        <w:t xml:space="preserve">Generate a reviewable consultation report containing the ethical question, initial position, stakeholder concerns, response to new information, any revisions, alternatives, recommendation, objection and response, conditions, and reflection. The required export format is </w:t>
+        <w:t xml:space="preserve">Generate a reviewable consultation report organized by the six steps: the moral problem and initial view, case-file notes, each option with its consequences and arguments, the choice with its defense and objection, and the action plan with any assessment. The required export format is </w:t>
       </w:r>
       <w:r>
         <w:rPr>
@@ -8101,7 +8167,7 @@
         <w:rPr>
           <w:sz w:val="20"/>
         </w:rPr>
-        <w:t>Repeat this record for each worksheet section.</w:t>
+        <w:t>Repeat this record for steps 1, 3, 4, 5, and 6.</w:t>
         <w:br/>
       </w:r>
       <w:r>
@@ -8430,7 +8496,7 @@
         <w:spacing w:line="240" w:lineRule="auto" w:after="80" w:before="120"/>
       </w:pPr>
       <w:r>
-        <w:t>Decision and feedback record</w:t>
+        <w:t>Options and decision record</w:t>
       </w:r>
     </w:p>
     <w:p>
@@ -8439,15 +8505,10 @@
       </w:pPr>
       <w:r>
         <w:rPr>
-          <w:sz w:val="20"/>
-        </w:rPr>
-      </w:r>
-      <w:r>
-        <w:rPr>
           <w:b/>
           <w:sz w:val="20"/>
         </w:rPr>
-        <w:t>Decision ID and question:</w:t>
+        <w:t>Options students should be able to find:</w:t>
       </w:r>
       <w:r>
         <w:rPr>
@@ -8461,7 +8522,21 @@
           <w:b/>
           <w:sz w:val="20"/>
         </w:rPr>
-        <w:t>Feasible options and reasons for each:</w:t>
+        <w:t>Your own option set and its perspectives:</w:t>
+      </w:r>
+      <w:r>
+        <w:rPr>
+          <w:sz w:val="20"/>
+        </w:rPr>
+        <w:t xml:space="preserve"> [shown after students choose]</w:t>
+        <w:br/>
+      </w:r>
+      <w:r>
+        <w:rPr>
+          <w:b/>
+          <w:sz w:val="20"/>
+        </w:rPr>
+        <w:t>Defense and objection prompts:</w:t>
       </w:r>
       <w:r>
         <w:rPr>
@@ -8475,13 +8550,13 @@
           <w:b/>
           <w:sz w:val="20"/>
         </w:rPr>
-        <w:t>Required rationale and objection prompts:</w:t>
+        <w:t>Action plan prompts:</w:t>
       </w:r>
       <w:r>
         <w:rPr>
           <w:sz w:val="20"/>
         </w:rPr>
-        <w:t xml:space="preserve"> [ ]</w:t>
+        <w:t xml:space="preserve"> [who does what first; what to watch for]</w:t>
         <w:br/>
       </w:r>
       <w:r>
@@ -8489,27 +8564,13 @@
           <w:b/>
           <w:sz w:val="20"/>
         </w:rPr>
-        <w:t>Feedback timing and approved text:</w:t>
+        <w:t>Follow-up part, if any:</w:t>
       </w:r>
       <w:r>
         <w:rPr>
           <w:sz w:val="20"/>
         </w:rPr>
-        <w:t xml:space="preserve"> [ ]</w:t>
-        <w:br/>
-      </w:r>
-      <w:r>
-        <w:rPr>
-          <w:b/>
-          <w:sz w:val="20"/>
-        </w:rPr>
-        <w:t>Conditions or uncertainties to address:</w:t>
-      </w:r>
-      <w:r>
-        <w:rPr>
-          <w:sz w:val="20"/>
-        </w:rPr>
-        <w:t xml:space="preserve"> [ ]</w:t>
+        <w:t xml:space="preserve"> [what happened next, when it is released, and the assessment prompt]</w:t>
         <w:br/>
       </w:r>
       <w:r>
@@ -8523,7 +8584,7 @@
         <w:rPr>
           <w:sz w:val="20"/>
         </w:rPr>
-        <w:t xml:space="preserve"> [section and response IDs]</w:t>
+        <w:t xml:space="preserve"> [section, prompt IDs, and option lists]</w:t>
       </w:r>
     </w:p>
     <w:p>
@@ -8771,6 +8832,14 @@
       </w:pPr>
       <w:r>
         <w:t>Each item appears in the intended release, later releases are marked New, and moving between areas preserves answers.</w:t>
+      </w:r>
+    </w:p>
+    <w:p>
+      <w:pPr>
+        <w:pStyle w:val="ListBullet"/>
+      </w:pPr>
+      <w:r>
+        <w:t>Students can add, rename, and remove options; step 4 shows each named option; the choice in step 5 comes from their own list; and the case’s own options appear only after they choose.</w:t>
       </w:r>
     </w:p>
     <w:p>

</xml_diff>

<commit_message>
Add a committee vote with minority view, and a consult note
Two standard blocks any case can add in one line. "dissent" records
whether the committee was unanimous and, if not, a required minority
view. "consultNote" is the short note left in the chart for the
clinician who asked, with a word-count guide. Both reach the report on
their own. A conditional answer kept after its choice changes is now
labelled and left out of the report. Manual and README updated.

Co-Authored-By: Claude Opus 5.5 <noreply@anthropic.com>
Claude-Session: https://claude.ai/code/session_01UAtA3GmVs4fdgvH26R4rvY
</commit_message>
<xml_diff>
--- a/planning/ETHOS_Bioethics_Simulator_Design_and_Iteration_Manual.docx
+++ b/planning/ETHOS_Bioethics_Simulator_Design_and_Iteration_Manual.docx
@@ -2268,7 +2268,7 @@
                 <w:color w:val="000000"/>
                 <w:sz w:val="19"/>
               </w:rPr>
-              <w:t>Choice, defense, objection and reply</w:t>
+              <w:t>Choice, defense, objection and reply, and the committee vote with any minority view</w:t>
             </w:r>
           </w:p>
         </w:tc>
@@ -2337,7 +2337,7 @@
                 <w:color w:val="000000"/>
                 <w:sz w:val="19"/>
               </w:rPr>
-              <w:t>Plan who does what first and what to watch for; in a follow-up part, assess what happened against the plan.</w:t>
+              <w:t>Write the consult note for the clinician who asked, and plan who does what first; in a follow-up part, assess what happened against the plan.</w:t>
             </w:r>
           </w:p>
         </w:tc>
@@ -2369,7 +2369,7 @@
                 <w:color w:val="000000"/>
                 <w:sz w:val="19"/>
               </w:rPr>
-              <w:t>Action plan and, if used, the assessment</w:t>
+              <w:t>Consult note, action plan, and, if used, the assessment</w:t>
             </w:r>
           </w:p>
         </w:tc>
@@ -5645,12 +5645,25 @@
     </w:p>
     <w:p>
       <w:r>
-        <w:t>Students identify the options themselves in step 3, so build the case so that several feasible options can be found in the case file, including some that are uncomfortable or easily overlooked. Write your own option set as well. The engine shows it only after students choose, as “Options others have considered,” so it can’t anchor their list; the debrief can compare the two. In your own set, avoid a polished “good” option beside obviously careless distractors.</w:t>
+        <w:t>Students identify the options themselves in step 3, so make sure the case file lets them find several feasible ones, including uncomfortable or easily missed ones. Write your own option set too; it appears only after students choose, as “Options others have considered,” so the debrief can compare lists. Avoid a polished “good” option beside careless distractors.</w:t>
       </w:r>
     </w:p>
     <w:p>
       <w:r>
-        <w:t>Ask students to identify the strongest objection to their recommendation and respond to it. Also ask what additional information could change their view. These prompts reveal whether students can evaluate their own position rather than merely defend it after choosing.</w:t>
+        <w:t>Ask students for the strongest objection to their recommendation and their reply, and what information could change their view. Then record the committee vote: when it isn’t unanimous, the minority view and its strongest reason go into the record, as on a real committee.</w:t>
+      </w:r>
+    </w:p>
+    <w:p>
+      <w:pPr>
+        <w:pStyle w:val="Heading2"/>
+      </w:pPr>
+      <w:r>
+        <w:t>Write the consult note</w:t>
+      </w:r>
+    </w:p>
+    <w:p>
+      <w:r>
+        <w:t>In step 6, students write the short note a committee leaves in the chart for the clinician who asked: the ethical question, relevant facts, recommendation, reasons, and next steps. A word guide (250 by default) keeps it readable but never blocks. The note opens the report.</w:t>
       </w:r>
     </w:p>
     <w:p>
@@ -6095,7 +6108,7 @@
                 <w:color w:val="000000"/>
                 <w:sz w:val="19"/>
               </w:rPr>
-              <w:t>Chosen option, defense, objection, and reply</w:t>
+              <w:t>Chosen option, defense, objection and reply, committee vote, and any minority view</w:t>
             </w:r>
           </w:p>
         </w:tc>
@@ -6164,7 +6177,7 @@
                 <w:color w:val="000000"/>
                 <w:sz w:val="19"/>
               </w:rPr>
-              <w:t>Action plan, what to watch for, and any follow-up assessment</w:t>
+              <w:t>Consult note for the chart, action plan, and any follow-up assessment</w:t>
             </w:r>
           </w:p>
         </w:tc>
@@ -6194,13 +6207,9 @@
       </w:r>
     </w:p>
     <w:p>
-      <w:r>
-        <w:br w:type="page"/>
-      </w:r>
-    </w:p>
-    <w:p>
       <w:pPr>
         <w:pStyle w:val="Heading1"/>
+        <w:pageBreakBefore/>
       </w:pPr>
       <w:r>
         <w:t>10 Classroom implementation</w:t>
@@ -7664,7 +7673,7 @@
                 <w:color w:val="000000"/>
                 <w:sz w:val="19"/>
               </w:rPr>
-              <w:t>Chooses an actionable course, defends it, and answers a serious objection.</w:t>
+              <w:t>Chooses an actionable course, defends it, answers a serious objection, and records any dissent fairly.</w:t>
             </w:r>
           </w:p>
         </w:tc>
@@ -7765,7 +7774,7 @@
                 <w:color w:val="000000"/>
                 <w:sz w:val="19"/>
               </w:rPr>
-              <w:t>Gives a realistic plan, says what would show it is working, and in a follow-up assesses the consequences honestly.</w:t>
+              <w:t>Writes a consult note a busy clinician could act on, gives a realistic plan, and in a follow-up assesses the consequences honestly.</w:t>
             </w:r>
           </w:p>
         </w:tc>
@@ -7888,7 +7897,7 @@
     </w:p>
     <w:p>
       <w:r>
-        <w:t>Organize the case around the six-step method: identify the moral problem; gather relevant information; identify the options and their likely consequences; evaluate arguments for and against; choose a course of action and defend it; carry it out and assess its consequences. Step 2 is a case file of numbered items (records and documents, people involved, plain-language medical background, and policies, codes and law) that students open in any order. The other steps are worksheet sections students answer in any order. Students list their own options, add arguments for each, and choose from their own list. Provide a visible Open the case file button on the opening screen, a navigation column listing the six steps with their status, clear instructions, and a named next action on every page.</w:t>
+        <w:t>Organize the case around the six-step method: identify the moral problem; gather relevant information; identify the options and their likely consequences; evaluate arguments for and against; choose a course of action and defend it; carry it out and assess its consequences. Step 2 is a case file of numbered items (records and documents, people involved, plain-language medical background, and policies, codes and law) that students open in any order. The other steps are worksheet sections students answer in any order. Students list their own options, add arguments for each, choose from their own list, record the committee vote with any minority view, and write a consult note for the requesting clinician. Provide a visible Open the case file button on the opening screen, a navigation column listing the six steps with their status, clear instructions, and a named next action on every page.</w:t>
       </w:r>
     </w:p>
     <w:p>
@@ -8550,13 +8559,13 @@
           <w:b/>
           <w:sz w:val="20"/>
         </w:rPr>
-        <w:t>Action plan prompts:</w:t>
+        <w:t>Action plan, vote, and note:</w:t>
       </w:r>
       <w:r>
         <w:rPr>
           <w:sz w:val="20"/>
         </w:rPr>
-        <w:t xml:space="preserve"> [who does what first; what to watch for]</w:t>
+        <w:t xml:space="preserve"> [plan prompts; dissent block; consult note addressed to whom]</w:t>
         <w:br/>
       </w:r>
       <w:r>
@@ -8839,7 +8848,7 @@
         <w:pStyle w:val="ListBullet"/>
       </w:pPr>
       <w:r>
-        <w:t>Students can add, rename, and remove options; step 4 shows each named option; the choice in step 5 comes from their own list; and the case’s own options appear only after they choose.</w:t>
+        <w:t>Students can add, rename, and remove options; step 4 shows each named option; the choice in step 5 comes from their own list; and the case’s own options appear only after they choose; the committee vote and consult note appear in the report.</w:t>
       </w:r>
     </w:p>
     <w:p>

</xml_diff>